<commit_message>
Update HDSD, dll 16.10.2026
</commit_message>
<xml_diff>
--- a/.Document/Tai lieu HDSD/II. DICH VU/3. HDSD_DichVu_CVDV.docx
+++ b/.Document/Tai lieu HDSD/II. DICH VU/3. HDSD_DichVu_CVDV.docx
@@ -3086,7 +3086,7 @@
       <w:r>
         <w:rPr>
           <w:rFonts w:ascii="Times New Roman" w:hAnsi="Times New Roman" w:cs="Times New Roman"/>
-          <w:lang w:val="en-US"/>
+          <w:lang w:val="en-GB" w:eastAsia="zh-CN"/>
         </w:rPr>
         <w:drawing>
           <wp:inline distT="0" distB="0" distL="0" distR="0" wp14:anchorId="0B9335D6" wp14:editId="5D7A7BF2">
@@ -3266,8 +3266,6 @@
         </w:rPr>
         <w:t>để Import báo giá từ DMS mới vào Cyber.</w:t>
       </w:r>
-      <w:bookmarkStart w:id="8" w:name="_GoBack"/>
-      <w:bookmarkEnd w:id="8"/>
     </w:p>
     <w:p>
       <w:pPr>
@@ -3999,7 +3997,7 @@
           <w:lang w:val="en-US"/>
         </w:rPr>
       </w:pPr>
-      <w:bookmarkStart w:id="9" w:name="_Toc237078558"/>
+      <w:bookmarkStart w:id="8" w:name="_Toc237078558"/>
       <w:r>
         <w:rPr>
           <w:rFonts w:ascii="Times New Roman" w:hAnsi="Times New Roman" w:cs="Times New Roman"/>
@@ -4025,7 +4023,7 @@
         </w:rPr>
         <w:t>lệnh sửa chữa</w:t>
       </w:r>
-      <w:bookmarkEnd w:id="9"/>
+      <w:bookmarkEnd w:id="8"/>
     </w:p>
     <w:p>
       <w:pPr>
@@ -4042,7 +4040,7 @@
           <w:lang w:val="en-US"/>
         </w:rPr>
       </w:pPr>
-      <w:bookmarkStart w:id="10" w:name="_Toc237078559"/>
+      <w:bookmarkStart w:id="9" w:name="_Toc237078559"/>
       <w:r>
         <w:rPr>
           <w:rFonts w:ascii="Times New Roman" w:hAnsi="Times New Roman" w:cs="Times New Roman"/>
@@ -4063,7 +4061,7 @@
         </w:rPr>
         <w:t>đích</w:t>
       </w:r>
-      <w:bookmarkEnd w:id="10"/>
+      <w:bookmarkEnd w:id="9"/>
     </w:p>
     <w:p>
       <w:pPr>
@@ -4107,7 +4105,7 @@
           <w:lang w:val="en-US"/>
         </w:rPr>
       </w:pPr>
-      <w:bookmarkStart w:id="11" w:name="_Toc237078560"/>
+      <w:bookmarkStart w:id="10" w:name="_Toc237078560"/>
       <w:r>
         <w:rPr>
           <w:rFonts w:ascii="Times New Roman" w:hAnsi="Times New Roman" w:cs="Times New Roman"/>
@@ -4128,7 +4126,7 @@
         </w:rPr>
         <w:t>: Quản lý dịch vụ \ Sửa chữa \ Lệnh sửa chữa.</w:t>
       </w:r>
-      <w:bookmarkEnd w:id="11"/>
+      <w:bookmarkEnd w:id="10"/>
     </w:p>
     <w:p>
       <w:pPr>
@@ -4194,7 +4192,7 @@
           <w:lang w:val="en-US"/>
         </w:rPr>
       </w:pPr>
-      <w:bookmarkStart w:id="12" w:name="_Toc237078561"/>
+      <w:bookmarkStart w:id="11" w:name="_Toc237078561"/>
       <w:r>
         <w:rPr>
           <w:rFonts w:ascii="Times New Roman" w:hAnsi="Times New Roman" w:cs="Times New Roman"/>
@@ -4215,7 +4213,7 @@
         </w:rPr>
         <w:t>thực hiện</w:t>
       </w:r>
-      <w:bookmarkEnd w:id="12"/>
+      <w:bookmarkEnd w:id="11"/>
     </w:p>
     <w:p>
       <w:pPr>
@@ -4483,7 +4481,7 @@
           <w:lang w:val="en-US"/>
         </w:rPr>
       </w:pPr>
-      <w:bookmarkStart w:id="13" w:name="_Toc237078562"/>
+      <w:bookmarkStart w:id="12" w:name="_Toc237078562"/>
       <w:r>
         <w:rPr>
           <w:rFonts w:ascii="Times New Roman" w:hAnsi="Times New Roman" w:cs="Times New Roman"/>
@@ -4497,7 +4495,7 @@
         <w:lastRenderedPageBreak/>
         <w:t>Lấy dữ liệu lệnh sửa chữa hãng</w:t>
       </w:r>
-      <w:bookmarkEnd w:id="13"/>
+      <w:bookmarkEnd w:id="12"/>
     </w:p>
     <w:p>
       <w:pPr>
@@ -4514,7 +4512,7 @@
           <w:lang w:val="en-US"/>
         </w:rPr>
       </w:pPr>
-      <w:bookmarkStart w:id="14" w:name="_Toc237078563"/>
+      <w:bookmarkStart w:id="13" w:name="_Toc237078563"/>
       <w:r>
         <w:rPr>
           <w:rFonts w:ascii="Times New Roman" w:hAnsi="Times New Roman" w:cs="Times New Roman"/>
@@ -4525,7 +4523,7 @@
         </w:rPr>
         <w:t>Mục đích</w:t>
       </w:r>
-      <w:bookmarkEnd w:id="14"/>
+      <w:bookmarkEnd w:id="13"/>
     </w:p>
     <w:p>
       <w:pPr>
@@ -4596,7 +4594,7 @@
           <w:lang w:val="en-US"/>
         </w:rPr>
       </w:pPr>
-      <w:bookmarkStart w:id="15" w:name="_Toc237078564"/>
+      <w:bookmarkStart w:id="14" w:name="_Toc237078564"/>
       <w:r>
         <w:rPr>
           <w:rFonts w:ascii="Times New Roman" w:hAnsi="Times New Roman" w:cs="Times New Roman"/>
@@ -4617,26 +4615,24 @@
         </w:rPr>
         <w:t>: Quản lý dịch vụ \ Sửa chữa \ Lấy dữ liệu lệnh sửa chữa hãng.</w:t>
       </w:r>
-      <w:bookmarkEnd w:id="15"/>
-    </w:p>
-    <w:p>
-      <w:pPr>
-        <w:jc w:val="center"/>
-        <w:rPr>
-          <w:rFonts w:ascii="Times New Roman" w:hAnsi="Times New Roman" w:cs="Times New Roman"/>
-          <w:lang w:val="en-US"/>
-        </w:rPr>
-      </w:pPr>
-      <w:r>
-        <w:rPr>
-          <w:rFonts w:ascii="Times New Roman" w:hAnsi="Times New Roman" w:cs="Times New Roman"/>
+      <w:bookmarkEnd w:id="14"/>
+    </w:p>
+    <w:p>
+      <w:pPr>
+        <w:rPr>
+          <w:rFonts w:ascii="Times New Roman" w:hAnsi="Times New Roman" w:cs="Times New Roman"/>
+          <w:lang w:val="en-US"/>
+        </w:rPr>
+      </w:pPr>
+      <w:r>
+        <w:rPr>
           <w:lang w:val="en-GB" w:eastAsia="zh-CN"/>
         </w:rPr>
         <w:drawing>
-          <wp:inline distT="0" distB="0" distL="0" distR="0" wp14:anchorId="71DE9900" wp14:editId="7C67D17B">
-            <wp:extent cx="4524292" cy="2879688"/>
-            <wp:effectExtent l="0" t="0" r="0" b="0"/>
-            <wp:docPr id="1448035357" name="Picture 1"/>
+          <wp:inline distT="0" distB="0" distL="0" distR="0" wp14:anchorId="61AB1147" wp14:editId="692DA62E">
+            <wp:extent cx="5731510" cy="3711575"/>
+            <wp:effectExtent l="0" t="0" r="2540" b="3175"/>
+            <wp:docPr id="2" name="Picture 2"/>
             <wp:cNvGraphicFramePr>
               <a:graphicFrameLocks xmlns:a="http://schemas.openxmlformats.org/drawingml/2006/main" noChangeAspect="1"/>
             </wp:cNvGraphicFramePr>
@@ -4644,7 +4640,7 @@
               <a:graphicData uri="http://schemas.openxmlformats.org/drawingml/2006/picture">
                 <pic:pic xmlns:pic="http://schemas.openxmlformats.org/drawingml/2006/picture">
                   <pic:nvPicPr>
-                    <pic:cNvPr id="1448035357" name=""/>
+                    <pic:cNvPr id="1" name=""/>
                     <pic:cNvPicPr/>
                   </pic:nvPicPr>
                   <pic:blipFill>
@@ -4656,7 +4652,7 @@
                   <pic:spPr>
                     <a:xfrm>
                       <a:off x="0" y="0"/>
-                      <a:ext cx="4546551" cy="2893856"/>
+                      <a:ext cx="5731510" cy="3711575"/>
                     </a:xfrm>
                     <a:prstGeom prst="rect">
                       <a:avLst/>
@@ -4684,7 +4680,7 @@
           <w:lang w:val="en-US"/>
         </w:rPr>
       </w:pPr>
-      <w:bookmarkStart w:id="16" w:name="_Toc237078565"/>
+      <w:bookmarkStart w:id="15" w:name="_Toc237078565"/>
       <w:r>
         <w:rPr>
           <w:rFonts w:ascii="Times New Roman" w:hAnsi="Times New Roman" w:cs="Times New Roman"/>
@@ -4695,7 +4691,7 @@
         </w:rPr>
         <w:t>Thao tác thực hiện</w:t>
       </w:r>
-      <w:bookmarkEnd w:id="16"/>
+      <w:bookmarkEnd w:id="15"/>
     </w:p>
     <w:p>
       <w:pPr>
@@ -4762,7 +4758,16 @@
           <w:rFonts w:ascii="Times New Roman" w:hAnsi="Times New Roman" w:cs="Times New Roman"/>
           <w:lang w:val="en-US"/>
         </w:rPr>
-        <w:t xml:space="preserve"> lấy dữ liệu lệnh sửa chữa từ hãng.</w:t>
+        <w:t xml:space="preserve"> lấy dữ </w:t>
+      </w:r>
+      <w:bookmarkStart w:id="16" w:name="_GoBack"/>
+      <w:bookmarkEnd w:id="16"/>
+      <w:r>
+        <w:rPr>
+          <w:rFonts w:ascii="Times New Roman" w:hAnsi="Times New Roman" w:cs="Times New Roman"/>
+          <w:lang w:val="en-US"/>
+        </w:rPr>
+        <w:t>liệu lệnh sửa chữa từ hãng.</w:t>
       </w:r>
       <w:r>
         <w:rPr>
@@ -4823,6 +4828,7 @@
           <w:rFonts w:ascii="Times New Roman" w:hAnsi="Times New Roman" w:cs="Times New Roman"/>
           <w:lang w:val="en-US"/>
         </w:rPr>
+        <w:lastRenderedPageBreak/>
         <w:t xml:space="preserve">User </w:t>
       </w:r>
       <w:r>
@@ -4953,7 +4959,6 @@
           <w:rFonts w:ascii="Times New Roman" w:hAnsi="Times New Roman" w:cs="Times New Roman"/>
           <w:lang w:val="en-GB"/>
         </w:rPr>
-        <w:lastRenderedPageBreak/>
         <w:t xml:space="preserve">Sau khi “Lấy dữ liệu” hệ thống sẽ </w:t>
       </w:r>
       <w:r>
@@ -5495,6 +5500,7 @@
           <w:rFonts w:ascii="Times New Roman" w:hAnsi="Times New Roman" w:cs="Times New Roman"/>
           <w:lang w:val="en-US"/>
         </w:rPr>
+        <w:lastRenderedPageBreak/>
         <w:t xml:space="preserve">User nhập </w:t>
       </w:r>
       <w:r>
@@ -5591,7 +5597,6 @@
           <w:rFonts w:ascii="Times New Roman" w:hAnsi="Times New Roman" w:cs="Times New Roman"/>
           <w:lang w:val="en-US"/>
         </w:rPr>
-        <w:lastRenderedPageBreak/>
         <w:t xml:space="preserve">Nếu không nhập Số R/O thì User nhập các </w:t>
       </w:r>
       <w:r>
@@ -7793,7 +7798,7 @@
 </file>
 
 <file path=customXml/itemProps1.xml><?xml version="1.0" encoding="utf-8"?>
-<ds:datastoreItem xmlns:ds="http://schemas.openxmlformats.org/officeDocument/2006/customXml" ds:itemID="{70552A65-64B7-421E-B362-A1EEBA9E826E}">
+<ds:datastoreItem xmlns:ds="http://schemas.openxmlformats.org/officeDocument/2006/customXml" ds:itemID="{FF90A09E-B08F-42AC-8D17-2F7217561255}">
   <ds:schemaRefs>
     <ds:schemaRef ds:uri="http://schemas.openxmlformats.org/officeDocument/2006/bibliography"/>
   </ds:schemaRefs>

</xml_diff>

<commit_message>
update tài liệu HDSD: thêm ảnh cảnh báo chiến dịch trên LSC
</commit_message>
<xml_diff>
--- a/.Document/Tai lieu HDSD/II. DICH VU/3. HDSD_DichVu_CVDV.docx
+++ b/.Document/Tai lieu HDSD/II. DICH VU/3. HDSD_DichVu_CVDV.docx
@@ -73,7 +73,7 @@
             </w:rPr>
             <w:fldChar w:fldCharType="separate"/>
           </w:r>
-          <w:hyperlink w:anchor="_Toc243925879" w:history="1">
+          <w:hyperlink w:anchor="_Toc243928206" w:history="1">
             <w:r>
               <w:rPr>
                 <w:rStyle w:val="Hyperlink"/>
@@ -117,7 +117,7 @@
               <w:rPr>
                 <w:webHidden/>
               </w:rPr>
-              <w:instrText xml:space="preserve"> PAGEREF _Toc243925879 \h </w:instrText>
+              <w:instrText xml:space="preserve"> PAGEREF _Toc243928206 \h </w:instrText>
             </w:r>
             <w:r>
               <w:rPr>
@@ -156,7 +156,7 @@
               <w:lang w:eastAsia="vi-VN"/>
             </w:rPr>
           </w:pPr>
-          <w:hyperlink w:anchor="_Toc243925880" w:history="1">
+          <w:hyperlink w:anchor="_Toc243928207" w:history="1">
             <w:r>
               <w:rPr>
                 <w:rStyle w:val="Hyperlink"/>
@@ -196,7 +196,7 @@
               <w:rPr>
                 <w:webHidden/>
               </w:rPr>
-              <w:instrText xml:space="preserve"> PAGEREF _Toc243925880 \h </w:instrText>
+              <w:instrText xml:space="preserve"> PAGEREF _Toc243928207 \h </w:instrText>
             </w:r>
             <w:r>
               <w:rPr>
@@ -235,7 +235,7 @@
               <w:lang w:eastAsia="vi-VN"/>
             </w:rPr>
           </w:pPr>
-          <w:hyperlink w:anchor="_Toc243925881" w:history="1">
+          <w:hyperlink w:anchor="_Toc243928208" w:history="1">
             <w:r>
               <w:rPr>
                 <w:rStyle w:val="Hyperlink"/>
@@ -275,7 +275,7 @@
               <w:rPr>
                 <w:webHidden/>
               </w:rPr>
-              <w:instrText xml:space="preserve"> PAGEREF _Toc243925881 \h </w:instrText>
+              <w:instrText xml:space="preserve"> PAGEREF _Toc243928208 \h </w:instrText>
             </w:r>
             <w:r>
               <w:rPr>
@@ -314,7 +314,7 @@
               <w:lang w:eastAsia="vi-VN"/>
             </w:rPr>
           </w:pPr>
-          <w:hyperlink w:anchor="_Toc243925882" w:history="1">
+          <w:hyperlink w:anchor="_Toc243928209" w:history="1">
             <w:r>
               <w:rPr>
                 <w:rStyle w:val="Hyperlink"/>
@@ -354,7 +354,7 @@
               <w:rPr>
                 <w:webHidden/>
               </w:rPr>
-              <w:instrText xml:space="preserve"> PAGEREF _Toc243925882 \h </w:instrText>
+              <w:instrText xml:space="preserve"> PAGEREF _Toc243928209 \h </w:instrText>
             </w:r>
             <w:r>
               <w:rPr>
@@ -393,7 +393,7 @@
               <w:lang w:eastAsia="vi-VN"/>
             </w:rPr>
           </w:pPr>
-          <w:hyperlink w:anchor="_Toc243925883" w:history="1">
+          <w:hyperlink w:anchor="_Toc243928210" w:history="1">
             <w:r>
               <w:rPr>
                 <w:rStyle w:val="Hyperlink"/>
@@ -437,7 +437,7 @@
               <w:rPr>
                 <w:webHidden/>
               </w:rPr>
-              <w:instrText xml:space="preserve"> PAGEREF _Toc243925883 \h </w:instrText>
+              <w:instrText xml:space="preserve"> PAGEREF _Toc243928210 \h </w:instrText>
             </w:r>
             <w:r>
               <w:rPr>
@@ -476,7 +476,7 @@
               <w:lang w:eastAsia="vi-VN"/>
             </w:rPr>
           </w:pPr>
-          <w:hyperlink w:anchor="_Toc243925884" w:history="1">
+          <w:hyperlink w:anchor="_Toc243928211" w:history="1">
             <w:r>
               <w:rPr>
                 <w:rStyle w:val="Hyperlink"/>
@@ -516,7 +516,7 @@
               <w:rPr>
                 <w:webHidden/>
               </w:rPr>
-              <w:instrText xml:space="preserve"> PAGEREF _Toc243925884 \h </w:instrText>
+              <w:instrText xml:space="preserve"> PAGEREF _Toc243928211 \h </w:instrText>
             </w:r>
             <w:r>
               <w:rPr>
@@ -555,7 +555,7 @@
               <w:lang w:eastAsia="vi-VN"/>
             </w:rPr>
           </w:pPr>
-          <w:hyperlink w:anchor="_Toc243925885" w:history="1">
+          <w:hyperlink w:anchor="_Toc243928212" w:history="1">
             <w:r>
               <w:rPr>
                 <w:rStyle w:val="Hyperlink"/>
@@ -595,7 +595,7 @@
               <w:rPr>
                 <w:webHidden/>
               </w:rPr>
-              <w:instrText xml:space="preserve"> PAGEREF _Toc243925885 \h </w:instrText>
+              <w:instrText xml:space="preserve"> PAGEREF _Toc243928212 \h </w:instrText>
             </w:r>
             <w:r>
               <w:rPr>
@@ -634,7 +634,7 @@
               <w:lang w:eastAsia="vi-VN"/>
             </w:rPr>
           </w:pPr>
-          <w:hyperlink w:anchor="_Toc243925886" w:history="1">
+          <w:hyperlink w:anchor="_Toc243928213" w:history="1">
             <w:r>
               <w:rPr>
                 <w:rStyle w:val="Hyperlink"/>
@@ -674,7 +674,7 @@
               <w:rPr>
                 <w:webHidden/>
               </w:rPr>
-              <w:instrText xml:space="preserve"> PAGEREF _Toc243925886 \h </w:instrText>
+              <w:instrText xml:space="preserve"> PAGEREF _Toc243928213 \h </w:instrText>
             </w:r>
             <w:r>
               <w:rPr>
@@ -713,7 +713,7 @@
               <w:lang w:eastAsia="vi-VN"/>
             </w:rPr>
           </w:pPr>
-          <w:hyperlink w:anchor="_Toc243925887" w:history="1">
+          <w:hyperlink w:anchor="_Toc243928214" w:history="1">
             <w:r>
               <w:rPr>
                 <w:rStyle w:val="Hyperlink"/>
@@ -757,7 +757,7 @@
               <w:rPr>
                 <w:webHidden/>
               </w:rPr>
-              <w:instrText xml:space="preserve"> PAGEREF _Toc243925887 \h </w:instrText>
+              <w:instrText xml:space="preserve"> PAGEREF _Toc243928214 \h </w:instrText>
             </w:r>
             <w:r>
               <w:rPr>
@@ -796,7 +796,7 @@
               <w:lang w:eastAsia="vi-VN"/>
             </w:rPr>
           </w:pPr>
-          <w:hyperlink w:anchor="_Toc243925888" w:history="1">
+          <w:hyperlink w:anchor="_Toc243928215" w:history="1">
             <w:r>
               <w:rPr>
                 <w:rStyle w:val="Hyperlink"/>
@@ -836,7 +836,7 @@
               <w:rPr>
                 <w:webHidden/>
               </w:rPr>
-              <w:instrText xml:space="preserve"> PAGEREF _Toc243925888 \h </w:instrText>
+              <w:instrText xml:space="preserve"> PAGEREF _Toc243928215 \h </w:instrText>
             </w:r>
             <w:r>
               <w:rPr>
@@ -875,7 +875,7 @@
               <w:lang w:eastAsia="vi-VN"/>
             </w:rPr>
           </w:pPr>
-          <w:hyperlink w:anchor="_Toc243925889" w:history="1">
+          <w:hyperlink w:anchor="_Toc243928216" w:history="1">
             <w:r>
               <w:rPr>
                 <w:rStyle w:val="Hyperlink"/>
@@ -915,7 +915,7 @@
               <w:rPr>
                 <w:webHidden/>
               </w:rPr>
-              <w:instrText xml:space="preserve"> PAGEREF _Toc243925889 \h </w:instrText>
+              <w:instrText xml:space="preserve"> PAGEREF _Toc243928216 \h </w:instrText>
             </w:r>
             <w:r>
               <w:rPr>
@@ -954,7 +954,7 @@
               <w:lang w:eastAsia="vi-VN"/>
             </w:rPr>
           </w:pPr>
-          <w:hyperlink w:anchor="_Toc243925890" w:history="1">
+          <w:hyperlink w:anchor="_Toc243928217" w:history="1">
             <w:r>
               <w:rPr>
                 <w:rStyle w:val="Hyperlink"/>
@@ -994,7 +994,7 @@
               <w:rPr>
                 <w:webHidden/>
               </w:rPr>
-              <w:instrText xml:space="preserve"> PAGEREF _Toc243925890 \h </w:instrText>
+              <w:instrText xml:space="preserve"> PAGEREF _Toc243928217 \h </w:instrText>
             </w:r>
             <w:r>
               <w:rPr>
@@ -1033,7 +1033,7 @@
               <w:lang w:eastAsia="vi-VN"/>
             </w:rPr>
           </w:pPr>
-          <w:hyperlink w:anchor="_Toc243925891" w:history="1">
+          <w:hyperlink w:anchor="_Toc243928218" w:history="1">
             <w:r>
               <w:rPr>
                 <w:rStyle w:val="Hyperlink"/>
@@ -1077,7 +1077,7 @@
               <w:rPr>
                 <w:webHidden/>
               </w:rPr>
-              <w:instrText xml:space="preserve"> PAGEREF _Toc243925891 \h </w:instrText>
+              <w:instrText xml:space="preserve"> PAGEREF _Toc243928218 \h </w:instrText>
             </w:r>
             <w:r>
               <w:rPr>
@@ -1116,7 +1116,7 @@
               <w:lang w:eastAsia="vi-VN"/>
             </w:rPr>
           </w:pPr>
-          <w:hyperlink w:anchor="_Toc243925892" w:history="1">
+          <w:hyperlink w:anchor="_Toc243928219" w:history="1">
             <w:r>
               <w:rPr>
                 <w:rStyle w:val="Hyperlink"/>
@@ -1156,7 +1156,7 @@
               <w:rPr>
                 <w:webHidden/>
               </w:rPr>
-              <w:instrText xml:space="preserve"> PAGEREF _Toc243925892 \h </w:instrText>
+              <w:instrText xml:space="preserve"> PAGEREF _Toc243928219 \h </w:instrText>
             </w:r>
             <w:r>
               <w:rPr>
@@ -1195,7 +1195,7 @@
               <w:lang w:eastAsia="vi-VN"/>
             </w:rPr>
           </w:pPr>
-          <w:hyperlink w:anchor="_Toc243925893" w:history="1">
+          <w:hyperlink w:anchor="_Toc243928220" w:history="1">
             <w:r>
               <w:rPr>
                 <w:rStyle w:val="Hyperlink"/>
@@ -1235,7 +1235,7 @@
               <w:rPr>
                 <w:webHidden/>
               </w:rPr>
-              <w:instrText xml:space="preserve"> PAGEREF _Toc243925893 \h </w:instrText>
+              <w:instrText xml:space="preserve"> PAGEREF _Toc243928220 \h </w:instrText>
             </w:r>
             <w:r>
               <w:rPr>
@@ -1274,7 +1274,7 @@
               <w:lang w:eastAsia="vi-VN"/>
             </w:rPr>
           </w:pPr>
-          <w:hyperlink w:anchor="_Toc243925894" w:history="1">
+          <w:hyperlink w:anchor="_Toc243928221" w:history="1">
             <w:r>
               <w:rPr>
                 <w:rStyle w:val="Hyperlink"/>
@@ -1314,7 +1314,7 @@
               <w:rPr>
                 <w:webHidden/>
               </w:rPr>
-              <w:instrText xml:space="preserve"> PAGEREF _Toc243925894 \h </w:instrText>
+              <w:instrText xml:space="preserve"> PAGEREF _Toc243928221 \h </w:instrText>
             </w:r>
             <w:r>
               <w:rPr>
@@ -1353,7 +1353,7 @@
               <w:lang w:eastAsia="vi-VN"/>
             </w:rPr>
           </w:pPr>
-          <w:hyperlink w:anchor="_Toc243925895" w:history="1">
+          <w:hyperlink w:anchor="_Toc243928222" w:history="1">
             <w:r>
               <w:rPr>
                 <w:rStyle w:val="Hyperlink"/>
@@ -1397,7 +1397,7 @@
               <w:rPr>
                 <w:webHidden/>
               </w:rPr>
-              <w:instrText xml:space="preserve"> PAGEREF _Toc243925895 \h </w:instrText>
+              <w:instrText xml:space="preserve"> PAGEREF _Toc243928222 \h </w:instrText>
             </w:r>
             <w:r>
               <w:rPr>
@@ -1436,7 +1436,7 @@
               <w:lang w:eastAsia="vi-VN"/>
             </w:rPr>
           </w:pPr>
-          <w:hyperlink w:anchor="_Toc243925896" w:history="1">
+          <w:hyperlink w:anchor="_Toc243928223" w:history="1">
             <w:r>
               <w:rPr>
                 <w:rStyle w:val="Hyperlink"/>
@@ -1476,7 +1476,7 @@
               <w:rPr>
                 <w:webHidden/>
               </w:rPr>
-              <w:instrText xml:space="preserve"> PAGEREF _Toc243925896 \h </w:instrText>
+              <w:instrText xml:space="preserve"> PAGEREF _Toc243928223 \h </w:instrText>
             </w:r>
             <w:r>
               <w:rPr>
@@ -1515,7 +1515,7 @@
               <w:lang w:eastAsia="vi-VN"/>
             </w:rPr>
           </w:pPr>
-          <w:hyperlink w:anchor="_Toc243925897" w:history="1">
+          <w:hyperlink w:anchor="_Toc243928224" w:history="1">
             <w:r>
               <w:rPr>
                 <w:rStyle w:val="Hyperlink"/>
@@ -1555,7 +1555,7 @@
               <w:rPr>
                 <w:webHidden/>
               </w:rPr>
-              <w:instrText xml:space="preserve"> PAGEREF _Toc243925897 \h </w:instrText>
+              <w:instrText xml:space="preserve"> PAGEREF _Toc243928224 \h </w:instrText>
             </w:r>
             <w:r>
               <w:rPr>
@@ -1594,7 +1594,7 @@
               <w:lang w:eastAsia="vi-VN"/>
             </w:rPr>
           </w:pPr>
-          <w:hyperlink w:anchor="_Toc243925898" w:history="1">
+          <w:hyperlink w:anchor="_Toc243928225" w:history="1">
             <w:r>
               <w:rPr>
                 <w:rStyle w:val="Hyperlink"/>
@@ -1634,7 +1634,7 @@
               <w:rPr>
                 <w:webHidden/>
               </w:rPr>
-              <w:instrText xml:space="preserve"> PAGEREF _Toc243925898 \h </w:instrText>
+              <w:instrText xml:space="preserve"> PAGEREF _Toc243928225 \h </w:instrText>
             </w:r>
             <w:r>
               <w:rPr>
@@ -1673,7 +1673,7 @@
               <w:lang w:eastAsia="vi-VN"/>
             </w:rPr>
           </w:pPr>
-          <w:hyperlink w:anchor="_Toc243925899" w:history="1">
+          <w:hyperlink w:anchor="_Toc243928226" w:history="1">
             <w:r>
               <w:rPr>
                 <w:rStyle w:val="Hyperlink"/>
@@ -1717,7 +1717,7 @@
               <w:rPr>
                 <w:webHidden/>
               </w:rPr>
-              <w:instrText xml:space="preserve"> PAGEREF _Toc243925899 \h </w:instrText>
+              <w:instrText xml:space="preserve"> PAGEREF _Toc243928226 \h </w:instrText>
             </w:r>
             <w:r>
               <w:rPr>
@@ -1756,7 +1756,7 @@
               <w:lang w:eastAsia="vi-VN"/>
             </w:rPr>
           </w:pPr>
-          <w:hyperlink w:anchor="_Toc243925900" w:history="1">
+          <w:hyperlink w:anchor="_Toc243928227" w:history="1">
             <w:r>
               <w:rPr>
                 <w:rStyle w:val="Hyperlink"/>
@@ -1796,7 +1796,7 @@
               <w:rPr>
                 <w:webHidden/>
               </w:rPr>
-              <w:instrText xml:space="preserve"> PAGEREF _Toc243925900 \h </w:instrText>
+              <w:instrText xml:space="preserve"> PAGEREF _Toc243928227 \h </w:instrText>
             </w:r>
             <w:r>
               <w:rPr>
@@ -1835,7 +1835,7 @@
               <w:lang w:eastAsia="vi-VN"/>
             </w:rPr>
           </w:pPr>
-          <w:hyperlink w:anchor="_Toc243925901" w:history="1">
+          <w:hyperlink w:anchor="_Toc243928228" w:history="1">
             <w:r>
               <w:rPr>
                 <w:rStyle w:val="Hyperlink"/>
@@ -1875,7 +1875,7 @@
               <w:rPr>
                 <w:webHidden/>
               </w:rPr>
-              <w:instrText xml:space="preserve"> PAGEREF _Toc243925901 \h </w:instrText>
+              <w:instrText xml:space="preserve"> PAGEREF _Toc243928228 \h </w:instrText>
             </w:r>
             <w:r>
               <w:rPr>
@@ -1914,7 +1914,7 @@
               <w:lang w:eastAsia="vi-VN"/>
             </w:rPr>
           </w:pPr>
-          <w:hyperlink w:anchor="_Toc243925902" w:history="1">
+          <w:hyperlink w:anchor="_Toc243928229" w:history="1">
             <w:r>
               <w:rPr>
                 <w:rStyle w:val="Hyperlink"/>
@@ -1954,7 +1954,7 @@
               <w:rPr>
                 <w:webHidden/>
               </w:rPr>
-              <w:instrText xml:space="preserve"> PAGEREF _Toc243925902 \h </w:instrText>
+              <w:instrText xml:space="preserve"> PAGEREF _Toc243928229 \h </w:instrText>
             </w:r>
             <w:r>
               <w:rPr>
@@ -2056,7 +2056,7 @@
           <w:lang w:val="en-US"/>
         </w:rPr>
       </w:pPr>
-      <w:bookmarkStart w:id="0" w:name="_Toc243925879"/>
+      <w:bookmarkStart w:id="0" w:name="_Toc243928206"/>
       <w:r>
         <w:rPr>
           <w:rFonts w:ascii="Times New Roman" w:hAnsi="Times New Roman" w:cs="Times New Roman"/>
@@ -2098,7 +2098,7 @@
           <w:lang w:val="en-US"/>
         </w:rPr>
       </w:pPr>
-      <w:bookmarkStart w:id="1" w:name="_Toc243925880"/>
+      <w:bookmarkStart w:id="1" w:name="_Toc243928207"/>
       <w:r>
         <w:rPr>
           <w:rFonts w:ascii="Times New Roman" w:hAnsi="Times New Roman" w:cs="Times New Roman"/>
@@ -2146,7 +2146,7 @@
           <w:lang w:val="en-US"/>
         </w:rPr>
       </w:pPr>
-      <w:bookmarkStart w:id="2" w:name="_Toc243925881"/>
+      <w:bookmarkStart w:id="2" w:name="_Toc243928208"/>
       <w:r>
         <w:rPr>
           <w:rFonts w:ascii="Times New Roman" w:hAnsi="Times New Roman" w:cs="Times New Roman"/>
@@ -2224,7 +2224,7 @@
           <w:lang w:val="en-US"/>
         </w:rPr>
       </w:pPr>
-      <w:bookmarkStart w:id="3" w:name="_Toc243925882"/>
+      <w:bookmarkStart w:id="3" w:name="_Toc243928209"/>
       <w:r>
         <w:rPr>
           <w:rFonts w:ascii="Times New Roman" w:hAnsi="Times New Roman" w:cs="Times New Roman"/>
@@ -2853,7 +2853,7 @@
           <w:lang w:val="en-US"/>
         </w:rPr>
       </w:pPr>
-      <w:bookmarkStart w:id="4" w:name="_Toc243925883"/>
+      <w:bookmarkStart w:id="4" w:name="_Toc243928210"/>
       <w:r>
         <w:rPr>
           <w:rFonts w:ascii="Times New Roman" w:hAnsi="Times New Roman" w:cs="Times New Roman"/>
@@ -2883,7 +2883,7 @@
           <w:lang w:val="en-US"/>
         </w:rPr>
       </w:pPr>
-      <w:bookmarkStart w:id="5" w:name="_Toc243925884"/>
+      <w:bookmarkStart w:id="5" w:name="_Toc243928211"/>
       <w:r>
         <w:rPr>
           <w:rFonts w:ascii="Times New Roman" w:hAnsi="Times New Roman" w:cs="Times New Roman"/>
@@ -2971,7 +2971,7 @@
           <w:lang w:val="en-US"/>
         </w:rPr>
       </w:pPr>
-      <w:bookmarkStart w:id="6" w:name="_Toc243925885"/>
+      <w:bookmarkStart w:id="6" w:name="_Toc243928212"/>
       <w:r>
         <w:rPr>
           <w:rFonts w:ascii="Times New Roman" w:hAnsi="Times New Roman" w:cs="Times New Roman"/>
@@ -3048,7 +3048,7 @@
           <w:lang w:val="en-US"/>
         </w:rPr>
       </w:pPr>
-      <w:bookmarkStart w:id="7" w:name="_Toc243925886"/>
+      <w:bookmarkStart w:id="7" w:name="_Toc243928213"/>
       <w:r>
         <w:rPr>
           <w:rFonts w:ascii="Times New Roman" w:hAnsi="Times New Roman" w:cs="Times New Roman"/>
@@ -3814,7 +3814,7 @@
         </w:rPr>
       </w:pPr>
       <w:bookmarkStart w:id="8" w:name="_Toc237078601"/>
-      <w:bookmarkStart w:id="9" w:name="_Toc243925887"/>
+      <w:bookmarkStart w:id="9" w:name="_Toc243928214"/>
       <w:r>
         <w:rPr>
           <w:rFonts w:ascii="Times New Roman" w:hAnsi="Times New Roman" w:cs="Times New Roman"/>
@@ -3825,691 +3825,107 @@
           <w:szCs w:val="24"/>
           <w:lang w:val="en-US"/>
         </w:rPr>
-        <w:t>C</w:t>
-      </w:r>
-      <w:r>
-        <w:rPr>
-          <w:rFonts w:ascii="Times New Roman" w:hAnsi="Times New Roman" w:cs="Times New Roman"/>
-          <w:b/>
-          <w:bCs/>
+        <w:t>Cập nhật chiến dịch trên lệnh sửa chữa</w:t>
+      </w:r>
+      <w:bookmarkEnd w:id="8"/>
+      <w:bookmarkEnd w:id="9"/>
+    </w:p>
+    <w:p>
+      <w:pPr>
+        <w:pStyle w:val="Heading2"/>
+        <w:numPr>
+          <w:ilvl w:val="0"/>
+          <w:numId w:val="9"/>
+        </w:numPr>
+        <w:rPr>
+          <w:rFonts w:ascii="Times New Roman" w:hAnsi="Times New Roman" w:cs="Times New Roman"/>
           <w:color w:val="auto"/>
           <w:sz w:val="24"/>
           <w:szCs w:val="24"/>
           <w:lang w:val="en-US"/>
         </w:rPr>
-        <w:t>ậ</w:t>
-      </w:r>
-      <w:r>
-        <w:rPr>
-          <w:rFonts w:ascii="Times New Roman" w:hAnsi="Times New Roman" w:cs="Times New Roman"/>
-          <w:b/>
-          <w:bCs/>
+      </w:pPr>
+      <w:bookmarkStart w:id="10" w:name="_Toc237078602"/>
+      <w:bookmarkStart w:id="11" w:name="_Toc243928215"/>
+      <w:r>
+        <w:rPr>
+          <w:rFonts w:ascii="Times New Roman" w:hAnsi="Times New Roman" w:cs="Times New Roman"/>
           <w:color w:val="auto"/>
           <w:sz w:val="24"/>
           <w:szCs w:val="24"/>
           <w:lang w:val="en-US"/>
         </w:rPr>
-        <w:t>p nh</w:t>
-      </w:r>
-      <w:r>
-        <w:rPr>
-          <w:rFonts w:ascii="Times New Roman" w:hAnsi="Times New Roman" w:cs="Times New Roman"/>
-          <w:b/>
-          <w:bCs/>
+        <w:t>Mục đích</w:t>
+      </w:r>
+      <w:bookmarkEnd w:id="10"/>
+      <w:bookmarkEnd w:id="11"/>
+    </w:p>
+    <w:p>
+      <w:pPr>
+        <w:pStyle w:val="ListParagraph"/>
+        <w:numPr>
+          <w:ilvl w:val="0"/>
+          <w:numId w:val="4"/>
+        </w:numPr>
+        <w:rPr>
+          <w:rFonts w:ascii="Times New Roman" w:hAnsi="Times New Roman" w:cs="Times New Roman"/>
+          <w:lang w:val="en-US"/>
+        </w:rPr>
+      </w:pPr>
+      <w:r>
+        <w:rPr>
+          <w:rFonts w:ascii="Times New Roman" w:hAnsi="Times New Roman" w:cs="Times New Roman"/>
+          <w:lang w:val="en-US"/>
+        </w:rPr>
+        <w:t>Ghi nhận xe vào xưởng có thực hiện chiến dịch của hãng.</w:t>
+      </w:r>
+    </w:p>
+    <w:p>
+      <w:pPr>
+        <w:pStyle w:val="ListParagraph"/>
+        <w:numPr>
+          <w:ilvl w:val="0"/>
+          <w:numId w:val="4"/>
+        </w:numPr>
+        <w:rPr>
+          <w:rFonts w:ascii="Times New Roman" w:hAnsi="Times New Roman" w:cs="Times New Roman"/>
+          <w:lang w:val="en-US"/>
+        </w:rPr>
+      </w:pPr>
+      <w:r>
+        <w:rPr>
+          <w:rFonts w:ascii="Times New Roman" w:hAnsi="Times New Roman" w:cs="Times New Roman"/>
+          <w:lang w:val="en-US"/>
+        </w:rPr>
+        <w:t>Làm căn cứ cho báo cáo kết quả thực hiện chiến dịch.</w:t>
+      </w:r>
+    </w:p>
+    <w:p>
+      <w:pPr>
+        <w:pStyle w:val="Heading2"/>
+        <w:numPr>
+          <w:ilvl w:val="0"/>
+          <w:numId w:val="9"/>
+        </w:numPr>
+        <w:rPr>
+          <w:rFonts w:ascii="Times New Roman" w:hAnsi="Times New Roman" w:cs="Times New Roman"/>
           <w:color w:val="auto"/>
           <w:sz w:val="24"/>
           <w:szCs w:val="24"/>
           <w:lang w:val="en-US"/>
         </w:rPr>
-        <w:t>ậ</w:t>
-      </w:r>
-      <w:r>
-        <w:rPr>
-          <w:rFonts w:ascii="Times New Roman" w:hAnsi="Times New Roman" w:cs="Times New Roman"/>
-          <w:b/>
-          <w:bCs/>
+      </w:pPr>
+      <w:bookmarkStart w:id="12" w:name="_Toc237078603"/>
+      <w:bookmarkStart w:id="13" w:name="_Toc243928216"/>
+      <w:r>
+        <w:rPr>
+          <w:rFonts w:ascii="Times New Roman" w:hAnsi="Times New Roman" w:cs="Times New Roman"/>
           <w:color w:val="auto"/>
           <w:sz w:val="24"/>
           <w:szCs w:val="24"/>
           <w:lang w:val="en-US"/>
         </w:rPr>
-        <w:t>t chi</w:t>
-      </w:r>
-      <w:r>
-        <w:rPr>
-          <w:rFonts w:ascii="Times New Roman" w:hAnsi="Times New Roman" w:cs="Times New Roman"/>
-          <w:b/>
-          <w:bCs/>
-          <w:color w:val="auto"/>
-          <w:sz w:val="24"/>
-          <w:szCs w:val="24"/>
-          <w:lang w:val="en-US"/>
-        </w:rPr>
-        <w:t>ế</w:t>
-      </w:r>
-      <w:r>
-        <w:rPr>
-          <w:rFonts w:ascii="Times New Roman" w:hAnsi="Times New Roman" w:cs="Times New Roman"/>
-          <w:b/>
-          <w:bCs/>
-          <w:color w:val="auto"/>
-          <w:sz w:val="24"/>
-          <w:szCs w:val="24"/>
-          <w:lang w:val="en-US"/>
-        </w:rPr>
-        <w:t>n d</w:t>
-      </w:r>
-      <w:r>
-        <w:rPr>
-          <w:rFonts w:ascii="Times New Roman" w:hAnsi="Times New Roman" w:cs="Times New Roman"/>
-          <w:b/>
-          <w:bCs/>
-          <w:color w:val="auto"/>
-          <w:sz w:val="24"/>
-          <w:szCs w:val="24"/>
-          <w:lang w:val="en-US"/>
-        </w:rPr>
-        <w:t>ị</w:t>
-      </w:r>
-      <w:r>
-        <w:rPr>
-          <w:rFonts w:ascii="Times New Roman" w:hAnsi="Times New Roman" w:cs="Times New Roman"/>
-          <w:b/>
-          <w:bCs/>
-          <w:color w:val="auto"/>
-          <w:sz w:val="24"/>
-          <w:szCs w:val="24"/>
-          <w:lang w:val="en-US"/>
-        </w:rPr>
-        <w:t>ch trên l</w:t>
-      </w:r>
-      <w:r>
-        <w:rPr>
-          <w:rFonts w:ascii="Times New Roman" w:hAnsi="Times New Roman" w:cs="Times New Roman"/>
-          <w:b/>
-          <w:bCs/>
-          <w:color w:val="auto"/>
-          <w:sz w:val="24"/>
-          <w:szCs w:val="24"/>
-          <w:lang w:val="en-US"/>
-        </w:rPr>
-        <w:t>ệ</w:t>
-      </w:r>
-      <w:r>
-        <w:rPr>
-          <w:rFonts w:ascii="Times New Roman" w:hAnsi="Times New Roman" w:cs="Times New Roman"/>
-          <w:b/>
-          <w:bCs/>
-          <w:color w:val="auto"/>
-          <w:sz w:val="24"/>
-          <w:szCs w:val="24"/>
-          <w:lang w:val="en-US"/>
-        </w:rPr>
-        <w:t>nh s</w:t>
-      </w:r>
-      <w:r>
-        <w:rPr>
-          <w:rFonts w:ascii="Times New Roman" w:hAnsi="Times New Roman" w:cs="Times New Roman"/>
-          <w:b/>
-          <w:bCs/>
-          <w:color w:val="auto"/>
-          <w:sz w:val="24"/>
-          <w:szCs w:val="24"/>
-          <w:lang w:val="en-US"/>
-        </w:rPr>
-        <w:t>ử</w:t>
-      </w:r>
-      <w:r>
-        <w:rPr>
-          <w:rFonts w:ascii="Times New Roman" w:hAnsi="Times New Roman" w:cs="Times New Roman"/>
-          <w:b/>
-          <w:bCs/>
-          <w:color w:val="auto"/>
-          <w:sz w:val="24"/>
-          <w:szCs w:val="24"/>
-          <w:lang w:val="en-US"/>
-        </w:rPr>
-        <w:t>a ch</w:t>
-      </w:r>
-      <w:r>
-        <w:rPr>
-          <w:rFonts w:ascii="Times New Roman" w:hAnsi="Times New Roman" w:cs="Times New Roman"/>
-          <w:b/>
-          <w:bCs/>
-          <w:color w:val="auto"/>
-          <w:sz w:val="24"/>
-          <w:szCs w:val="24"/>
-          <w:lang w:val="en-US"/>
-        </w:rPr>
-        <w:t>ữ</w:t>
-      </w:r>
-      <w:r>
-        <w:rPr>
-          <w:rFonts w:ascii="Times New Roman" w:hAnsi="Times New Roman" w:cs="Times New Roman"/>
-          <w:b/>
-          <w:bCs/>
-          <w:color w:val="auto"/>
-          <w:sz w:val="24"/>
-          <w:szCs w:val="24"/>
-          <w:lang w:val="en-US"/>
-        </w:rPr>
-        <w:t>a</w:t>
-      </w:r>
-      <w:bookmarkEnd w:id="8"/>
-      <w:bookmarkEnd w:id="9"/>
-    </w:p>
-    <w:p>
-      <w:pPr>
-        <w:pStyle w:val="Heading2"/>
-        <w:numPr>
-          <w:ilvl w:val="0"/>
-          <w:numId w:val="9"/>
-        </w:numPr>
-        <w:rPr>
-          <w:rFonts w:ascii="Times New Roman" w:hAnsi="Times New Roman" w:cs="Times New Roman"/>
-          <w:color w:val="auto"/>
-          <w:sz w:val="24"/>
-          <w:szCs w:val="24"/>
-          <w:lang w:val="en-US"/>
-        </w:rPr>
-      </w:pPr>
-      <w:bookmarkStart w:id="10" w:name="_Toc237078602"/>
-      <w:bookmarkStart w:id="11" w:name="_Toc243925888"/>
-      <w:r>
-        <w:rPr>
-          <w:rFonts w:ascii="Times New Roman" w:hAnsi="Times New Roman" w:cs="Times New Roman"/>
-          <w:color w:val="auto"/>
-          <w:sz w:val="24"/>
-          <w:szCs w:val="24"/>
-          <w:lang w:val="en-US"/>
-        </w:rPr>
-        <w:t>M</w:t>
-      </w:r>
-      <w:r>
-        <w:rPr>
-          <w:rFonts w:ascii="Times New Roman" w:hAnsi="Times New Roman" w:cs="Times New Roman"/>
-          <w:color w:val="auto"/>
-          <w:sz w:val="24"/>
-          <w:szCs w:val="24"/>
-          <w:lang w:val="en-US"/>
-        </w:rPr>
-        <w:t>ụ</w:t>
-      </w:r>
-      <w:r>
-        <w:rPr>
-          <w:rFonts w:ascii="Times New Roman" w:hAnsi="Times New Roman" w:cs="Times New Roman"/>
-          <w:color w:val="auto"/>
-          <w:sz w:val="24"/>
-          <w:szCs w:val="24"/>
-          <w:lang w:val="en-US"/>
-        </w:rPr>
-        <w:t>c đích</w:t>
-      </w:r>
-      <w:bookmarkEnd w:id="10"/>
-      <w:bookmarkEnd w:id="11"/>
-    </w:p>
-    <w:p>
-      <w:pPr>
-        <w:pStyle w:val="ListParagraph"/>
-        <w:numPr>
-          <w:ilvl w:val="0"/>
-          <w:numId w:val="4"/>
-        </w:numPr>
-        <w:rPr>
-          <w:rFonts w:ascii="Times New Roman" w:hAnsi="Times New Roman" w:cs="Times New Roman"/>
-          <w:lang w:val="en-US"/>
-        </w:rPr>
-      </w:pPr>
-      <w:r>
-        <w:rPr>
-          <w:rFonts w:ascii="Times New Roman" w:hAnsi="Times New Roman" w:cs="Times New Roman"/>
-          <w:lang w:val="en-US"/>
-        </w:rPr>
-        <w:t>Ghi nh</w:t>
-      </w:r>
-      <w:r>
-        <w:rPr>
-          <w:rFonts w:ascii="Times New Roman" w:hAnsi="Times New Roman" w:cs="Times New Roman"/>
-          <w:lang w:val="en-US"/>
-        </w:rPr>
-        <w:t>ậ</w:t>
-      </w:r>
-      <w:r>
-        <w:rPr>
-          <w:rFonts w:ascii="Times New Roman" w:hAnsi="Times New Roman" w:cs="Times New Roman"/>
-          <w:lang w:val="en-US"/>
-        </w:rPr>
-        <w:t>n xe vào xư</w:t>
-      </w:r>
-      <w:r>
-        <w:rPr>
-          <w:rFonts w:ascii="Times New Roman" w:hAnsi="Times New Roman" w:cs="Times New Roman"/>
-          <w:lang w:val="en-US"/>
-        </w:rPr>
-        <w:t>ở</w:t>
-      </w:r>
-      <w:r>
-        <w:rPr>
-          <w:rFonts w:ascii="Times New Roman" w:hAnsi="Times New Roman" w:cs="Times New Roman"/>
-          <w:lang w:val="en-US"/>
-        </w:rPr>
-        <w:t>ng có th</w:t>
-      </w:r>
-      <w:r>
-        <w:rPr>
-          <w:rFonts w:ascii="Times New Roman" w:hAnsi="Times New Roman" w:cs="Times New Roman"/>
-          <w:lang w:val="en-US"/>
-        </w:rPr>
-        <w:t>ự</w:t>
-      </w:r>
-      <w:r>
-        <w:rPr>
-          <w:rFonts w:ascii="Times New Roman" w:hAnsi="Times New Roman" w:cs="Times New Roman"/>
-          <w:lang w:val="en-US"/>
-        </w:rPr>
-        <w:t>c hi</w:t>
-      </w:r>
-      <w:r>
-        <w:rPr>
-          <w:rFonts w:ascii="Times New Roman" w:hAnsi="Times New Roman" w:cs="Times New Roman"/>
-          <w:lang w:val="en-US"/>
-        </w:rPr>
-        <w:t>ệ</w:t>
-      </w:r>
-      <w:r>
-        <w:rPr>
-          <w:rFonts w:ascii="Times New Roman" w:hAnsi="Times New Roman" w:cs="Times New Roman"/>
-          <w:lang w:val="en-US"/>
-        </w:rPr>
-        <w:t>n chi</w:t>
-      </w:r>
-      <w:r>
-        <w:rPr>
-          <w:rFonts w:ascii="Times New Roman" w:hAnsi="Times New Roman" w:cs="Times New Roman"/>
-          <w:lang w:val="en-US"/>
-        </w:rPr>
-        <w:t>ế</w:t>
-      </w:r>
-      <w:r>
-        <w:rPr>
-          <w:rFonts w:ascii="Times New Roman" w:hAnsi="Times New Roman" w:cs="Times New Roman"/>
-          <w:lang w:val="en-US"/>
-        </w:rPr>
-        <w:t>n d</w:t>
-      </w:r>
-      <w:r>
-        <w:rPr>
-          <w:rFonts w:ascii="Times New Roman" w:hAnsi="Times New Roman" w:cs="Times New Roman"/>
-          <w:lang w:val="en-US"/>
-        </w:rPr>
-        <w:t>ị</w:t>
-      </w:r>
-      <w:r>
-        <w:rPr>
-          <w:rFonts w:ascii="Times New Roman" w:hAnsi="Times New Roman" w:cs="Times New Roman"/>
-          <w:lang w:val="en-US"/>
-        </w:rPr>
-        <w:t>ch c</w:t>
-      </w:r>
-      <w:r>
-        <w:rPr>
-          <w:rFonts w:ascii="Times New Roman" w:hAnsi="Times New Roman" w:cs="Times New Roman"/>
-          <w:lang w:val="en-US"/>
-        </w:rPr>
-        <w:t>ủ</w:t>
-      </w:r>
-      <w:r>
-        <w:rPr>
-          <w:rFonts w:ascii="Times New Roman" w:hAnsi="Times New Roman" w:cs="Times New Roman"/>
-          <w:lang w:val="en-US"/>
-        </w:rPr>
-        <w:t>a hãng.</w:t>
-      </w:r>
-    </w:p>
-    <w:p>
-      <w:pPr>
-        <w:pStyle w:val="ListParagraph"/>
-        <w:numPr>
-          <w:ilvl w:val="0"/>
-          <w:numId w:val="4"/>
-        </w:numPr>
-        <w:rPr>
-          <w:rFonts w:ascii="Times New Roman" w:hAnsi="Times New Roman" w:cs="Times New Roman"/>
-          <w:lang w:val="en-US"/>
-        </w:rPr>
-      </w:pPr>
-      <w:r>
-        <w:rPr>
-          <w:rFonts w:ascii="Times New Roman" w:hAnsi="Times New Roman" w:cs="Times New Roman"/>
-          <w:lang w:val="en-US"/>
-        </w:rPr>
-        <w:t>Làm căn c</w:t>
-      </w:r>
-      <w:r>
-        <w:rPr>
-          <w:rFonts w:ascii="Times New Roman" w:hAnsi="Times New Roman" w:cs="Times New Roman"/>
-          <w:lang w:val="en-US"/>
-        </w:rPr>
-        <w:t>ứ</w:t>
-      </w:r>
-      <w:r>
-        <w:rPr>
-          <w:rFonts w:ascii="Times New Roman" w:hAnsi="Times New Roman" w:cs="Times New Roman"/>
-          <w:lang w:val="en-US"/>
-        </w:rPr>
-        <w:t xml:space="preserve"> cho báo cáo k</w:t>
-      </w:r>
-      <w:r>
-        <w:rPr>
-          <w:rFonts w:ascii="Times New Roman" w:hAnsi="Times New Roman" w:cs="Times New Roman"/>
-          <w:lang w:val="en-US"/>
-        </w:rPr>
-        <w:t>ế</w:t>
-      </w:r>
-      <w:r>
-        <w:rPr>
-          <w:rFonts w:ascii="Times New Roman" w:hAnsi="Times New Roman" w:cs="Times New Roman"/>
-          <w:lang w:val="en-US"/>
-        </w:rPr>
-        <w:t>t qu</w:t>
-      </w:r>
-      <w:r>
-        <w:rPr>
-          <w:rFonts w:ascii="Times New Roman" w:hAnsi="Times New Roman" w:cs="Times New Roman"/>
-          <w:lang w:val="en-US"/>
-        </w:rPr>
-        <w:t>ả</w:t>
-      </w:r>
-      <w:r>
-        <w:rPr>
-          <w:rFonts w:ascii="Times New Roman" w:hAnsi="Times New Roman" w:cs="Times New Roman"/>
-          <w:lang w:val="en-US"/>
-        </w:rPr>
-        <w:t xml:space="preserve"> th</w:t>
-      </w:r>
-      <w:r>
-        <w:rPr>
-          <w:rFonts w:ascii="Times New Roman" w:hAnsi="Times New Roman" w:cs="Times New Roman"/>
-          <w:lang w:val="en-US"/>
-        </w:rPr>
-        <w:t>ự</w:t>
-      </w:r>
-      <w:r>
-        <w:rPr>
-          <w:rFonts w:ascii="Times New Roman" w:hAnsi="Times New Roman" w:cs="Times New Roman"/>
-          <w:lang w:val="en-US"/>
-        </w:rPr>
-        <w:t>c hi</w:t>
-      </w:r>
-      <w:r>
-        <w:rPr>
-          <w:rFonts w:ascii="Times New Roman" w:hAnsi="Times New Roman" w:cs="Times New Roman"/>
-          <w:lang w:val="en-US"/>
-        </w:rPr>
-        <w:t>ệ</w:t>
-      </w:r>
-      <w:r>
-        <w:rPr>
-          <w:rFonts w:ascii="Times New Roman" w:hAnsi="Times New Roman" w:cs="Times New Roman"/>
-          <w:lang w:val="en-US"/>
-        </w:rPr>
-        <w:t>n chi</w:t>
-      </w:r>
-      <w:r>
-        <w:rPr>
-          <w:rFonts w:ascii="Times New Roman" w:hAnsi="Times New Roman" w:cs="Times New Roman"/>
-          <w:lang w:val="en-US"/>
-        </w:rPr>
-        <w:t>ế</w:t>
-      </w:r>
-      <w:r>
-        <w:rPr>
-          <w:rFonts w:ascii="Times New Roman" w:hAnsi="Times New Roman" w:cs="Times New Roman"/>
-          <w:lang w:val="en-US"/>
-        </w:rPr>
-        <w:t>n d</w:t>
-      </w:r>
-      <w:r>
-        <w:rPr>
-          <w:rFonts w:ascii="Times New Roman" w:hAnsi="Times New Roman" w:cs="Times New Roman"/>
-          <w:lang w:val="en-US"/>
-        </w:rPr>
-        <w:t>ị</w:t>
-      </w:r>
-      <w:r>
-        <w:rPr>
-          <w:rFonts w:ascii="Times New Roman" w:hAnsi="Times New Roman" w:cs="Times New Roman"/>
-          <w:lang w:val="en-US"/>
-        </w:rPr>
-        <w:t>ch.</w:t>
-      </w:r>
-    </w:p>
-    <w:p>
-      <w:pPr>
-        <w:pStyle w:val="Heading2"/>
-        <w:numPr>
-          <w:ilvl w:val="0"/>
-          <w:numId w:val="9"/>
-        </w:numPr>
-        <w:rPr>
-          <w:rFonts w:ascii="Times New Roman" w:hAnsi="Times New Roman" w:cs="Times New Roman"/>
-          <w:color w:val="auto"/>
-          <w:sz w:val="24"/>
-          <w:szCs w:val="24"/>
-          <w:lang w:val="en-US"/>
-        </w:rPr>
-      </w:pPr>
-      <w:bookmarkStart w:id="12" w:name="_Toc237078603"/>
-      <w:bookmarkStart w:id="13" w:name="_Toc243925889"/>
-      <w:r>
-        <w:rPr>
-          <w:rFonts w:ascii="Times New Roman" w:hAnsi="Times New Roman" w:cs="Times New Roman"/>
-          <w:color w:val="auto"/>
-          <w:sz w:val="24"/>
-          <w:szCs w:val="24"/>
-          <w:lang w:val="en-US"/>
-        </w:rPr>
-        <w:t>Đư</w:t>
-      </w:r>
-      <w:r>
-        <w:rPr>
-          <w:rFonts w:ascii="Times New Roman" w:hAnsi="Times New Roman" w:cs="Times New Roman"/>
-          <w:color w:val="auto"/>
-          <w:sz w:val="24"/>
-          <w:szCs w:val="24"/>
-          <w:lang w:val="en-US"/>
-        </w:rPr>
-        <w:t>ờ</w:t>
-      </w:r>
-      <w:r>
-        <w:rPr>
-          <w:rFonts w:ascii="Times New Roman" w:hAnsi="Times New Roman" w:cs="Times New Roman"/>
-          <w:color w:val="auto"/>
-          <w:sz w:val="24"/>
-          <w:szCs w:val="24"/>
-          <w:lang w:val="en-US"/>
-        </w:rPr>
-        <w:t>ng d</w:t>
-      </w:r>
-      <w:r>
-        <w:rPr>
-          <w:rFonts w:ascii="Times New Roman" w:hAnsi="Times New Roman" w:cs="Times New Roman"/>
-          <w:color w:val="auto"/>
-          <w:sz w:val="24"/>
-          <w:szCs w:val="24"/>
-          <w:lang w:val="en-US"/>
-        </w:rPr>
-        <w:t>ẫ</w:t>
-      </w:r>
-      <w:r>
-        <w:rPr>
-          <w:rFonts w:ascii="Times New Roman" w:hAnsi="Times New Roman" w:cs="Times New Roman"/>
-          <w:color w:val="auto"/>
-          <w:sz w:val="24"/>
-          <w:szCs w:val="24"/>
-          <w:lang w:val="en-US"/>
-        </w:rPr>
-        <w:t>n: Qu</w:t>
-      </w:r>
-      <w:r>
-        <w:rPr>
-          <w:rFonts w:ascii="Times New Roman" w:hAnsi="Times New Roman" w:cs="Times New Roman"/>
-          <w:color w:val="auto"/>
-          <w:sz w:val="24"/>
-          <w:szCs w:val="24"/>
-          <w:lang w:val="en-US"/>
-        </w:rPr>
-        <w:t>ả</w:t>
-      </w:r>
-      <w:r>
-        <w:rPr>
-          <w:rFonts w:ascii="Times New Roman" w:hAnsi="Times New Roman" w:cs="Times New Roman"/>
-          <w:color w:val="auto"/>
-          <w:sz w:val="24"/>
-          <w:szCs w:val="24"/>
-          <w:lang w:val="en-US"/>
-        </w:rPr>
-        <w:t>n lý d</w:t>
-      </w:r>
-      <w:r>
-        <w:rPr>
-          <w:rFonts w:ascii="Times New Roman" w:hAnsi="Times New Roman" w:cs="Times New Roman"/>
-          <w:color w:val="auto"/>
-          <w:sz w:val="24"/>
-          <w:szCs w:val="24"/>
-          <w:lang w:val="en-US"/>
-        </w:rPr>
-        <w:t>ị</w:t>
-      </w:r>
-      <w:r>
-        <w:rPr>
-          <w:rFonts w:ascii="Times New Roman" w:hAnsi="Times New Roman" w:cs="Times New Roman"/>
-          <w:color w:val="auto"/>
-          <w:sz w:val="24"/>
-          <w:szCs w:val="24"/>
-          <w:lang w:val="en-US"/>
-        </w:rPr>
-        <w:t>ch v</w:t>
-      </w:r>
-      <w:r>
-        <w:rPr>
-          <w:rFonts w:ascii="Times New Roman" w:hAnsi="Times New Roman" w:cs="Times New Roman"/>
-          <w:color w:val="auto"/>
-          <w:sz w:val="24"/>
-          <w:szCs w:val="24"/>
-          <w:lang w:val="en-US"/>
-        </w:rPr>
-        <w:t>ụ</w:t>
-      </w:r>
-      <w:r>
-        <w:rPr>
-          <w:rFonts w:ascii="Times New Roman" w:hAnsi="Times New Roman" w:cs="Times New Roman"/>
-          <w:color w:val="auto"/>
-          <w:sz w:val="24"/>
-          <w:szCs w:val="24"/>
-          <w:lang w:val="en-US"/>
-        </w:rPr>
-        <w:t xml:space="preserve"> \ S</w:t>
-      </w:r>
-      <w:r>
-        <w:rPr>
-          <w:rFonts w:ascii="Times New Roman" w:hAnsi="Times New Roman" w:cs="Times New Roman"/>
-          <w:color w:val="auto"/>
-          <w:sz w:val="24"/>
-          <w:szCs w:val="24"/>
-          <w:lang w:val="en-US"/>
-        </w:rPr>
-        <w:t>ử</w:t>
-      </w:r>
-      <w:r>
-        <w:rPr>
-          <w:rFonts w:ascii="Times New Roman" w:hAnsi="Times New Roman" w:cs="Times New Roman"/>
-          <w:color w:val="auto"/>
-          <w:sz w:val="24"/>
-          <w:szCs w:val="24"/>
-          <w:lang w:val="en-US"/>
-        </w:rPr>
-        <w:t>a ch</w:t>
-      </w:r>
-      <w:r>
-        <w:rPr>
-          <w:rFonts w:ascii="Times New Roman" w:hAnsi="Times New Roman" w:cs="Times New Roman"/>
-          <w:color w:val="auto"/>
-          <w:sz w:val="24"/>
-          <w:szCs w:val="24"/>
-          <w:lang w:val="en-US"/>
-        </w:rPr>
-        <w:t>ữ</w:t>
-      </w:r>
-      <w:r>
-        <w:rPr>
-          <w:rFonts w:ascii="Times New Roman" w:hAnsi="Times New Roman" w:cs="Times New Roman"/>
-          <w:color w:val="auto"/>
-          <w:sz w:val="24"/>
-          <w:szCs w:val="24"/>
-          <w:lang w:val="en-US"/>
-        </w:rPr>
-        <w:t>a \ L</w:t>
-      </w:r>
-      <w:r>
-        <w:rPr>
-          <w:rFonts w:ascii="Times New Roman" w:hAnsi="Times New Roman" w:cs="Times New Roman"/>
-          <w:color w:val="auto"/>
-          <w:sz w:val="24"/>
-          <w:szCs w:val="24"/>
-          <w:lang w:val="en-US"/>
-        </w:rPr>
-        <w:t>ệ</w:t>
-      </w:r>
-      <w:r>
-        <w:rPr>
-          <w:rFonts w:ascii="Times New Roman" w:hAnsi="Times New Roman" w:cs="Times New Roman"/>
-          <w:color w:val="auto"/>
-          <w:sz w:val="24"/>
-          <w:szCs w:val="24"/>
-          <w:lang w:val="en-US"/>
-        </w:rPr>
-        <w:t>nh s</w:t>
-      </w:r>
-      <w:r>
-        <w:rPr>
-          <w:rFonts w:ascii="Times New Roman" w:hAnsi="Times New Roman" w:cs="Times New Roman"/>
-          <w:color w:val="auto"/>
-          <w:sz w:val="24"/>
-          <w:szCs w:val="24"/>
-          <w:lang w:val="en-US"/>
-        </w:rPr>
-        <w:t>ử</w:t>
-      </w:r>
-      <w:r>
-        <w:rPr>
-          <w:rFonts w:ascii="Times New Roman" w:hAnsi="Times New Roman" w:cs="Times New Roman"/>
-          <w:color w:val="auto"/>
-          <w:sz w:val="24"/>
-          <w:szCs w:val="24"/>
-          <w:lang w:val="en-US"/>
-        </w:rPr>
-        <w:t>a ch</w:t>
-      </w:r>
-      <w:r>
-        <w:rPr>
-          <w:rFonts w:ascii="Times New Roman" w:hAnsi="Times New Roman" w:cs="Times New Roman"/>
-          <w:color w:val="auto"/>
-          <w:sz w:val="24"/>
-          <w:szCs w:val="24"/>
-          <w:lang w:val="en-US"/>
-        </w:rPr>
-        <w:t>ữ</w:t>
-      </w:r>
-      <w:r>
-        <w:rPr>
-          <w:rFonts w:ascii="Times New Roman" w:hAnsi="Times New Roman" w:cs="Times New Roman"/>
-          <w:color w:val="auto"/>
-          <w:sz w:val="24"/>
-          <w:szCs w:val="24"/>
-          <w:lang w:val="en-US"/>
-        </w:rPr>
-        <w:t>a.</w:t>
+        <w:t>Đường dẫn: Quản lý dịch vụ \ Sửa chữa \ Lệnh sửa chữa.</w:t>
       </w:r>
       <w:bookmarkEnd w:id="12"/>
       <w:bookmarkEnd w:id="13"/>
@@ -4579,7 +3995,7 @@
         </w:rPr>
       </w:pPr>
       <w:bookmarkStart w:id="14" w:name="_Toc237078604"/>
-      <w:bookmarkStart w:id="15" w:name="_Toc243925890"/>
+      <w:bookmarkStart w:id="15" w:name="_Toc243928217"/>
       <w:r>
         <w:rPr>
           <w:rFonts w:ascii="Times New Roman" w:hAnsi="Times New Roman" w:cs="Times New Roman"/>
@@ -4588,47 +4004,7 @@
           <w:szCs w:val="24"/>
           <w:lang w:val="en-US"/>
         </w:rPr>
-        <w:t>Thao tác th</w:t>
-      </w:r>
-      <w:r>
-        <w:rPr>
-          <w:rFonts w:ascii="Times New Roman" w:hAnsi="Times New Roman" w:cs="Times New Roman"/>
-          <w:color w:val="auto"/>
-          <w:sz w:val="24"/>
-          <w:szCs w:val="24"/>
-          <w:lang w:val="en-US"/>
-        </w:rPr>
-        <w:t>ự</w:t>
-      </w:r>
-      <w:r>
-        <w:rPr>
-          <w:rFonts w:ascii="Times New Roman" w:hAnsi="Times New Roman" w:cs="Times New Roman"/>
-          <w:color w:val="auto"/>
-          <w:sz w:val="24"/>
-          <w:szCs w:val="24"/>
-          <w:lang w:val="en-US"/>
-        </w:rPr>
-        <w:t>c hi</w:t>
-      </w:r>
-      <w:r>
-        <w:rPr>
-          <w:rFonts w:ascii="Times New Roman" w:hAnsi="Times New Roman" w:cs="Times New Roman"/>
-          <w:color w:val="auto"/>
-          <w:sz w:val="24"/>
-          <w:szCs w:val="24"/>
-          <w:lang w:val="en-US"/>
-        </w:rPr>
-        <w:t>ệ</w:t>
-      </w:r>
-      <w:r>
-        <w:rPr>
-          <w:rFonts w:ascii="Times New Roman" w:hAnsi="Times New Roman" w:cs="Times New Roman"/>
-          <w:color w:val="auto"/>
-          <w:sz w:val="24"/>
-          <w:szCs w:val="24"/>
-          <w:lang w:val="en-US"/>
-        </w:rPr>
-        <w:t>n</w:t>
+        <w:t>Thao tác thực hiện</w:t>
       </w:r>
       <w:bookmarkEnd w:id="14"/>
       <w:bookmarkEnd w:id="15"/>
@@ -4650,77 +4026,7 @@
           <w:rFonts w:ascii="Times New Roman" w:hAnsi="Times New Roman" w:cs="Times New Roman"/>
           <w:lang w:val="en-US"/>
         </w:rPr>
-        <w:t>User truy c</w:t>
-      </w:r>
-      <w:r>
-        <w:rPr>
-          <w:rFonts w:ascii="Times New Roman" w:hAnsi="Times New Roman" w:cs="Times New Roman"/>
-          <w:lang w:val="en-US"/>
-        </w:rPr>
-        <w:t>ậ</w:t>
-      </w:r>
-      <w:r>
-        <w:rPr>
-          <w:rFonts w:ascii="Times New Roman" w:hAnsi="Times New Roman" w:cs="Times New Roman"/>
-          <w:lang w:val="en-US"/>
-        </w:rPr>
-        <w:t>p phi</w:t>
-      </w:r>
-      <w:r>
-        <w:rPr>
-          <w:rFonts w:ascii="Times New Roman" w:hAnsi="Times New Roman" w:cs="Times New Roman"/>
-          <w:lang w:val="en-US"/>
-        </w:rPr>
-        <w:t>ế</w:t>
-      </w:r>
-      <w:r>
-        <w:rPr>
-          <w:rFonts w:ascii="Times New Roman" w:hAnsi="Times New Roman" w:cs="Times New Roman"/>
-          <w:lang w:val="en-US"/>
-        </w:rPr>
-        <w:t>u l</w:t>
-      </w:r>
-      <w:r>
-        <w:rPr>
-          <w:rFonts w:ascii="Times New Roman" w:hAnsi="Times New Roman" w:cs="Times New Roman"/>
-          <w:lang w:val="en-US"/>
-        </w:rPr>
-        <w:t>ệ</w:t>
-      </w:r>
-      <w:r>
-        <w:rPr>
-          <w:rFonts w:ascii="Times New Roman" w:hAnsi="Times New Roman" w:cs="Times New Roman"/>
-          <w:lang w:val="en-US"/>
-        </w:rPr>
-        <w:t>nh s</w:t>
-      </w:r>
-      <w:r>
-        <w:rPr>
-          <w:rFonts w:ascii="Times New Roman" w:hAnsi="Times New Roman" w:cs="Times New Roman"/>
-          <w:lang w:val="en-US"/>
-        </w:rPr>
-        <w:t>ử</w:t>
-      </w:r>
-      <w:r>
-        <w:rPr>
-          <w:rFonts w:ascii="Times New Roman" w:hAnsi="Times New Roman" w:cs="Times New Roman"/>
-          <w:lang w:val="en-US"/>
-        </w:rPr>
-        <w:t>a ch</w:t>
-      </w:r>
-      <w:r>
-        <w:rPr>
-          <w:rFonts w:ascii="Times New Roman" w:hAnsi="Times New Roman" w:cs="Times New Roman"/>
-          <w:lang w:val="en-US"/>
-        </w:rPr>
-        <w:t>ữ</w:t>
-      </w:r>
-      <w:r>
-        <w:rPr>
-          <w:rFonts w:ascii="Times New Roman" w:hAnsi="Times New Roman" w:cs="Times New Roman"/>
-          <w:lang w:val="en-US"/>
-        </w:rPr>
-        <w:t>a.</w:t>
+        <w:t>User truy cập phiếu lệnh sửa chữa.</w:t>
       </w:r>
     </w:p>
     <w:p>
@@ -4740,105 +4046,7 @@
           <w:rFonts w:ascii="Times New Roman" w:hAnsi="Times New Roman" w:cs="Times New Roman"/>
           <w:lang w:val="en-US"/>
         </w:rPr>
-        <w:t>V</w:t>
-      </w:r>
-      <w:r>
-        <w:rPr>
-          <w:rFonts w:ascii="Times New Roman" w:hAnsi="Times New Roman" w:cs="Times New Roman"/>
-          <w:lang w:val="en-US"/>
-        </w:rPr>
-        <w:t>ớ</w:t>
-      </w:r>
-      <w:r>
-        <w:rPr>
-          <w:rFonts w:ascii="Times New Roman" w:hAnsi="Times New Roman" w:cs="Times New Roman"/>
-          <w:lang w:val="en-US"/>
-        </w:rPr>
-        <w:t>i l</w:t>
-      </w:r>
-      <w:r>
-        <w:rPr>
-          <w:rFonts w:ascii="Times New Roman" w:hAnsi="Times New Roman" w:cs="Times New Roman"/>
-          <w:lang w:val="en-US"/>
-        </w:rPr>
-        <w:t>ệ</w:t>
-      </w:r>
-      <w:r>
-        <w:rPr>
-          <w:rFonts w:ascii="Times New Roman" w:hAnsi="Times New Roman" w:cs="Times New Roman"/>
-          <w:lang w:val="en-US"/>
-        </w:rPr>
-        <w:t>nh đã l</w:t>
-      </w:r>
-      <w:r>
-        <w:rPr>
-          <w:rFonts w:ascii="Times New Roman" w:hAnsi="Times New Roman" w:cs="Times New Roman"/>
-          <w:lang w:val="en-US"/>
-        </w:rPr>
-        <w:t>ậ</w:t>
-      </w:r>
-      <w:r>
-        <w:rPr>
-          <w:rFonts w:ascii="Times New Roman" w:hAnsi="Times New Roman" w:cs="Times New Roman"/>
-          <w:lang w:val="en-US"/>
-        </w:rPr>
-        <w:t>p, User tìm đ</w:t>
-      </w:r>
-      <w:r>
-        <w:rPr>
-          <w:rFonts w:ascii="Times New Roman" w:hAnsi="Times New Roman" w:cs="Times New Roman"/>
-          <w:lang w:val="en-US"/>
-        </w:rPr>
-        <w:t>ế</w:t>
-      </w:r>
-      <w:r>
-        <w:rPr>
-          <w:rFonts w:ascii="Times New Roman" w:hAnsi="Times New Roman" w:cs="Times New Roman"/>
-          <w:lang w:val="en-US"/>
-        </w:rPr>
-        <w:t>n l</w:t>
-      </w:r>
-      <w:r>
-        <w:rPr>
-          <w:rFonts w:ascii="Times New Roman" w:hAnsi="Times New Roman" w:cs="Times New Roman"/>
-          <w:lang w:val="en-US"/>
-        </w:rPr>
-        <w:t>ệ</w:t>
-      </w:r>
-      <w:r>
-        <w:rPr>
-          <w:rFonts w:ascii="Times New Roman" w:hAnsi="Times New Roman" w:cs="Times New Roman"/>
-          <w:lang w:val="en-US"/>
-        </w:rPr>
-        <w:t>nh c</w:t>
-      </w:r>
-      <w:r>
-        <w:rPr>
-          <w:rFonts w:ascii="Times New Roman" w:hAnsi="Times New Roman" w:cs="Times New Roman"/>
-          <w:lang w:val="en-US"/>
-        </w:rPr>
-        <w:t>ủ</w:t>
-      </w:r>
-      <w:r>
-        <w:rPr>
-          <w:rFonts w:ascii="Times New Roman" w:hAnsi="Times New Roman" w:cs="Times New Roman"/>
-          <w:lang w:val="en-US"/>
-        </w:rPr>
-        <w:t>a xe r</w:t>
-      </w:r>
-      <w:r>
-        <w:rPr>
-          <w:rFonts w:ascii="Times New Roman" w:hAnsi="Times New Roman" w:cs="Times New Roman"/>
-          <w:lang w:val="en-US"/>
-        </w:rPr>
-        <w:t>ồ</w:t>
-      </w:r>
-      <w:r>
-        <w:rPr>
-          <w:rFonts w:ascii="Times New Roman" w:hAnsi="Times New Roman" w:cs="Times New Roman"/>
-          <w:lang w:val="en-US"/>
-        </w:rPr>
-        <w:t xml:space="preserve">i click </w:t>
+        <w:t xml:space="preserve">Với lệnh đã lập, User tìm đến lệnh của xe rồi click </w:t>
       </w:r>
       <w:r>
         <w:rPr>
@@ -4886,91 +4094,7 @@
           <w:rFonts w:ascii="Times New Roman" w:hAnsi="Times New Roman" w:cs="Times New Roman"/>
           <w:lang w:val="en-US"/>
         </w:rPr>
-        <w:t>. V</w:t>
-      </w:r>
-      <w:r>
-        <w:rPr>
-          <w:rFonts w:ascii="Times New Roman" w:hAnsi="Times New Roman" w:cs="Times New Roman"/>
-          <w:lang w:val="en-US"/>
-        </w:rPr>
-        <w:t>ớ</w:t>
-      </w:r>
-      <w:r>
-        <w:rPr>
-          <w:rFonts w:ascii="Times New Roman" w:hAnsi="Times New Roman" w:cs="Times New Roman"/>
-          <w:lang w:val="en-US"/>
-        </w:rPr>
-        <w:t>i l</w:t>
-      </w:r>
-      <w:r>
-        <w:rPr>
-          <w:rFonts w:ascii="Times New Roman" w:hAnsi="Times New Roman" w:cs="Times New Roman"/>
-          <w:lang w:val="en-US"/>
-        </w:rPr>
-        <w:t>ệ</w:t>
-      </w:r>
-      <w:r>
-        <w:rPr>
-          <w:rFonts w:ascii="Times New Roman" w:hAnsi="Times New Roman" w:cs="Times New Roman"/>
-          <w:lang w:val="en-US"/>
-        </w:rPr>
-        <w:t>nh m</w:t>
-      </w:r>
-      <w:r>
-        <w:rPr>
-          <w:rFonts w:ascii="Times New Roman" w:hAnsi="Times New Roman" w:cs="Times New Roman"/>
-          <w:lang w:val="en-US"/>
-        </w:rPr>
-        <w:t>ớ</w:t>
-      </w:r>
-      <w:r>
-        <w:rPr>
-          <w:rFonts w:ascii="Times New Roman" w:hAnsi="Times New Roman" w:cs="Times New Roman"/>
-          <w:lang w:val="en-US"/>
-        </w:rPr>
-        <w:t>i, User l</w:t>
-      </w:r>
-      <w:r>
-        <w:rPr>
-          <w:rFonts w:ascii="Times New Roman" w:hAnsi="Times New Roman" w:cs="Times New Roman"/>
-          <w:lang w:val="en-US"/>
-        </w:rPr>
-        <w:t>ậ</w:t>
-      </w:r>
-      <w:r>
-        <w:rPr>
-          <w:rFonts w:ascii="Times New Roman" w:hAnsi="Times New Roman" w:cs="Times New Roman"/>
-          <w:lang w:val="en-US"/>
-        </w:rPr>
-        <w:t>p l</w:t>
-      </w:r>
-      <w:r>
-        <w:rPr>
-          <w:rFonts w:ascii="Times New Roman" w:hAnsi="Times New Roman" w:cs="Times New Roman"/>
-          <w:lang w:val="en-US"/>
-        </w:rPr>
-        <w:t>ệ</w:t>
-      </w:r>
-      <w:r>
-        <w:rPr>
-          <w:rFonts w:ascii="Times New Roman" w:hAnsi="Times New Roman" w:cs="Times New Roman"/>
-          <w:lang w:val="en-US"/>
-        </w:rPr>
-        <w:t>nh theo m</w:t>
-      </w:r>
-      <w:r>
-        <w:rPr>
-          <w:rFonts w:ascii="Times New Roman" w:hAnsi="Times New Roman" w:cs="Times New Roman"/>
-          <w:lang w:val="en-US"/>
-        </w:rPr>
-        <w:t>ụ</w:t>
-      </w:r>
-      <w:r>
-        <w:rPr>
-          <w:rFonts w:ascii="Times New Roman" w:hAnsi="Times New Roman" w:cs="Times New Roman"/>
-          <w:lang w:val="en-US"/>
-        </w:rPr>
-        <w:t>c 2.</w:t>
+        <w:t>. Với lệnh mới, User lập lệnh theo mục 2.</w:t>
       </w:r>
     </w:p>
     <w:p>
@@ -4990,63 +4114,7 @@
           <w:rFonts w:ascii="Times New Roman" w:hAnsi="Times New Roman" w:cs="Times New Roman"/>
           <w:lang w:val="en-US"/>
         </w:rPr>
-        <w:t>Ki</w:t>
-      </w:r>
-      <w:r>
-        <w:rPr>
-          <w:rFonts w:ascii="Times New Roman" w:hAnsi="Times New Roman" w:cs="Times New Roman"/>
-          <w:lang w:val="en-US"/>
-        </w:rPr>
-        <w:t>ể</w:t>
-      </w:r>
-      <w:r>
-        <w:rPr>
-          <w:rFonts w:ascii="Times New Roman" w:hAnsi="Times New Roman" w:cs="Times New Roman"/>
-          <w:lang w:val="en-US"/>
-        </w:rPr>
-        <w:t>m tra ô S</w:t>
-      </w:r>
-      <w:r>
-        <w:rPr>
-          <w:rFonts w:ascii="Times New Roman" w:hAnsi="Times New Roman" w:cs="Times New Roman"/>
-          <w:lang w:val="en-US"/>
-        </w:rPr>
-        <w:t>ố</w:t>
-      </w:r>
-      <w:r>
-        <w:rPr>
-          <w:rFonts w:ascii="Times New Roman" w:hAnsi="Times New Roman" w:cs="Times New Roman"/>
-          <w:lang w:val="en-US"/>
-        </w:rPr>
-        <w:t xml:space="preserve"> khung đã có s</w:t>
-      </w:r>
-      <w:r>
-        <w:rPr>
-          <w:rFonts w:ascii="Times New Roman" w:hAnsi="Times New Roman" w:cs="Times New Roman"/>
-          <w:lang w:val="en-US"/>
-        </w:rPr>
-        <w:t>ố</w:t>
-      </w:r>
-      <w:r>
-        <w:rPr>
-          <w:rFonts w:ascii="Times New Roman" w:hAnsi="Times New Roman" w:cs="Times New Roman"/>
-          <w:lang w:val="en-US"/>
-        </w:rPr>
-        <w:t xml:space="preserve"> khung c</w:t>
-      </w:r>
-      <w:r>
-        <w:rPr>
-          <w:rFonts w:ascii="Times New Roman" w:hAnsi="Times New Roman" w:cs="Times New Roman"/>
-          <w:lang w:val="en-US"/>
-        </w:rPr>
-        <w:t>ủ</w:t>
-      </w:r>
-      <w:r>
-        <w:rPr>
-          <w:rFonts w:ascii="Times New Roman" w:hAnsi="Times New Roman" w:cs="Times New Roman"/>
-          <w:lang w:val="en-US"/>
-        </w:rPr>
-        <w:t>a xe.</w:t>
+        <w:t>Kiểm tra ô Số khung đã có số khung của xe.</w:t>
       </w:r>
     </w:p>
     <w:p>
@@ -5066,63 +4134,7 @@
           <w:rFonts w:ascii="Times New Roman" w:hAnsi="Times New Roman" w:cs="Times New Roman"/>
           <w:lang w:val="en-US"/>
         </w:rPr>
-        <w:t>T</w:t>
-      </w:r>
-      <w:r>
-        <w:rPr>
-          <w:rFonts w:ascii="Times New Roman" w:hAnsi="Times New Roman" w:cs="Times New Roman"/>
-          <w:lang w:val="en-US"/>
-        </w:rPr>
-        <w:t>ạ</w:t>
-      </w:r>
-      <w:r>
-        <w:rPr>
-          <w:rFonts w:ascii="Times New Roman" w:hAnsi="Times New Roman" w:cs="Times New Roman"/>
-          <w:lang w:val="en-US"/>
-        </w:rPr>
-        <w:t>i ô “Chi</w:t>
-      </w:r>
-      <w:r>
-        <w:rPr>
-          <w:rFonts w:ascii="Times New Roman" w:hAnsi="Times New Roman" w:cs="Times New Roman"/>
-          <w:lang w:val="en-US"/>
-        </w:rPr>
-        <w:t>ế</w:t>
-      </w:r>
-      <w:r>
-        <w:rPr>
-          <w:rFonts w:ascii="Times New Roman" w:hAnsi="Times New Roman" w:cs="Times New Roman"/>
-          <w:lang w:val="en-US"/>
-        </w:rPr>
-        <w:t>n d</w:t>
-      </w:r>
-      <w:r>
-        <w:rPr>
-          <w:rFonts w:ascii="Times New Roman" w:hAnsi="Times New Roman" w:cs="Times New Roman"/>
-          <w:lang w:val="en-US"/>
-        </w:rPr>
-        <w:t>ị</w:t>
-      </w:r>
-      <w:r>
-        <w:rPr>
-          <w:rFonts w:ascii="Times New Roman" w:hAnsi="Times New Roman" w:cs="Times New Roman"/>
-          <w:lang w:val="en-US"/>
-        </w:rPr>
-        <w:t>ch”, User click nút “...” bên ph</w:t>
-      </w:r>
-      <w:r>
-        <w:rPr>
-          <w:rFonts w:ascii="Times New Roman" w:hAnsi="Times New Roman" w:cs="Times New Roman"/>
-          <w:lang w:val="en-US"/>
-        </w:rPr>
-        <w:t>ả</w:t>
-      </w:r>
-      <w:r>
-        <w:rPr>
-          <w:rFonts w:ascii="Times New Roman" w:hAnsi="Times New Roman" w:cs="Times New Roman"/>
-          <w:lang w:val="en-US"/>
-        </w:rPr>
-        <w:t>i.</w:t>
+        <w:t>Tại ô “Chiến dịch”, User click nút “...” bên phải.</w:t>
       </w:r>
     </w:p>
     <w:p>
@@ -5191,161 +4203,7 @@
           <w:rFonts w:ascii="Times New Roman" w:hAnsi="Times New Roman" w:cs="Times New Roman"/>
           <w:lang w:val="en-US"/>
         </w:rPr>
-        <w:t>H</w:t>
-      </w:r>
-      <w:r>
-        <w:rPr>
-          <w:rFonts w:ascii="Times New Roman" w:hAnsi="Times New Roman" w:cs="Times New Roman"/>
-          <w:lang w:val="en-US"/>
-        </w:rPr>
-        <w:t>ệ</w:t>
-      </w:r>
-      <w:r>
-        <w:rPr>
-          <w:rFonts w:ascii="Times New Roman" w:hAnsi="Times New Roman" w:cs="Times New Roman"/>
-          <w:lang w:val="en-US"/>
-        </w:rPr>
-        <w:t xml:space="preserve"> th</w:t>
-      </w:r>
-      <w:r>
-        <w:rPr>
-          <w:rFonts w:ascii="Times New Roman" w:hAnsi="Times New Roman" w:cs="Times New Roman"/>
-          <w:lang w:val="en-US"/>
-        </w:rPr>
-        <w:t>ố</w:t>
-      </w:r>
-      <w:r>
-        <w:rPr>
-          <w:rFonts w:ascii="Times New Roman" w:hAnsi="Times New Roman" w:cs="Times New Roman"/>
-          <w:lang w:val="en-US"/>
-        </w:rPr>
-        <w:t>ng hi</w:t>
-      </w:r>
-      <w:r>
-        <w:rPr>
-          <w:rFonts w:ascii="Times New Roman" w:hAnsi="Times New Roman" w:cs="Times New Roman"/>
-          <w:lang w:val="en-US"/>
-        </w:rPr>
-        <w:t>ể</w:t>
-      </w:r>
-      <w:r>
-        <w:rPr>
-          <w:rFonts w:ascii="Times New Roman" w:hAnsi="Times New Roman" w:cs="Times New Roman"/>
-          <w:lang w:val="en-US"/>
-        </w:rPr>
-        <w:t>n th</w:t>
-      </w:r>
-      <w:r>
-        <w:rPr>
-          <w:rFonts w:ascii="Times New Roman" w:hAnsi="Times New Roman" w:cs="Times New Roman"/>
-          <w:lang w:val="en-US"/>
-        </w:rPr>
-        <w:t>ị</w:t>
-      </w:r>
-      <w:r>
-        <w:rPr>
-          <w:rFonts w:ascii="Times New Roman" w:hAnsi="Times New Roman" w:cs="Times New Roman"/>
-          <w:lang w:val="en-US"/>
-        </w:rPr>
-        <w:t xml:space="preserve"> danh sách các chi</w:t>
-      </w:r>
-      <w:r>
-        <w:rPr>
-          <w:rFonts w:ascii="Times New Roman" w:hAnsi="Times New Roman" w:cs="Times New Roman"/>
-          <w:lang w:val="en-US"/>
-        </w:rPr>
-        <w:t>ế</w:t>
-      </w:r>
-      <w:r>
-        <w:rPr>
-          <w:rFonts w:ascii="Times New Roman" w:hAnsi="Times New Roman" w:cs="Times New Roman"/>
-          <w:lang w:val="en-US"/>
-        </w:rPr>
-        <w:t>n d</w:t>
-      </w:r>
-      <w:r>
-        <w:rPr>
-          <w:rFonts w:ascii="Times New Roman" w:hAnsi="Times New Roman" w:cs="Times New Roman"/>
-          <w:lang w:val="en-US"/>
-        </w:rPr>
-        <w:t>ị</w:t>
-      </w:r>
-      <w:r>
-        <w:rPr>
-          <w:rFonts w:ascii="Times New Roman" w:hAnsi="Times New Roman" w:cs="Times New Roman"/>
-          <w:lang w:val="en-US"/>
-        </w:rPr>
-        <w:t>ch mà s</w:t>
-      </w:r>
-      <w:r>
-        <w:rPr>
-          <w:rFonts w:ascii="Times New Roman" w:hAnsi="Times New Roman" w:cs="Times New Roman"/>
-          <w:lang w:val="en-US"/>
-        </w:rPr>
-        <w:t>ố</w:t>
-      </w:r>
-      <w:r>
-        <w:rPr>
-          <w:rFonts w:ascii="Times New Roman" w:hAnsi="Times New Roman" w:cs="Times New Roman"/>
-          <w:lang w:val="en-US"/>
-        </w:rPr>
-        <w:t xml:space="preserve"> khung c</w:t>
-      </w:r>
-      <w:r>
-        <w:rPr>
-          <w:rFonts w:ascii="Times New Roman" w:hAnsi="Times New Roman" w:cs="Times New Roman"/>
-          <w:lang w:val="en-US"/>
-        </w:rPr>
-        <w:t>ủ</w:t>
-      </w:r>
-      <w:r>
-        <w:rPr>
-          <w:rFonts w:ascii="Times New Roman" w:hAnsi="Times New Roman" w:cs="Times New Roman"/>
-          <w:lang w:val="en-US"/>
-        </w:rPr>
-        <w:t>a xe đã đư</w:t>
-      </w:r>
-      <w:r>
-        <w:rPr>
-          <w:rFonts w:ascii="Times New Roman" w:hAnsi="Times New Roman" w:cs="Times New Roman"/>
-          <w:lang w:val="en-US"/>
-        </w:rPr>
-        <w:t>ợ</w:t>
-      </w:r>
-      <w:r>
-        <w:rPr>
-          <w:rFonts w:ascii="Times New Roman" w:hAnsi="Times New Roman" w:cs="Times New Roman"/>
-          <w:lang w:val="en-US"/>
-        </w:rPr>
-        <w:t>c đăng ký và chưa th</w:t>
-      </w:r>
-      <w:r>
-        <w:rPr>
-          <w:rFonts w:ascii="Times New Roman" w:hAnsi="Times New Roman" w:cs="Times New Roman"/>
-          <w:lang w:val="en-US"/>
-        </w:rPr>
-        <w:t>ự</w:t>
-      </w:r>
-      <w:r>
-        <w:rPr>
-          <w:rFonts w:ascii="Times New Roman" w:hAnsi="Times New Roman" w:cs="Times New Roman"/>
-          <w:lang w:val="en-US"/>
-        </w:rPr>
-        <w:t>c hi</w:t>
-      </w:r>
-      <w:r>
-        <w:rPr>
-          <w:rFonts w:ascii="Times New Roman" w:hAnsi="Times New Roman" w:cs="Times New Roman"/>
-          <w:lang w:val="en-US"/>
-        </w:rPr>
-        <w:t>ệ</w:t>
-      </w:r>
-      <w:r>
-        <w:rPr>
-          <w:rFonts w:ascii="Times New Roman" w:hAnsi="Times New Roman" w:cs="Times New Roman"/>
-          <w:lang w:val="en-US"/>
-        </w:rPr>
-        <w:t>n.</w:t>
+        <w:t>Hệ thống hiển thị danh sách các chiến dịch mà số khung của xe đã được đăng ký và chưa thực hiện.</w:t>
       </w:r>
     </w:p>
     <w:p>
@@ -5365,189 +4223,7 @@
           <w:rFonts w:ascii="Times New Roman" w:hAnsi="Times New Roman" w:cs="Times New Roman"/>
           <w:lang w:val="en-US"/>
         </w:rPr>
-        <w:t>User tích ch</w:t>
-      </w:r>
-      <w:r>
-        <w:rPr>
-          <w:rFonts w:ascii="Times New Roman" w:hAnsi="Times New Roman" w:cs="Times New Roman"/>
-          <w:lang w:val="en-US"/>
-        </w:rPr>
-        <w:t>ọ</w:t>
-      </w:r>
-      <w:r>
-        <w:rPr>
-          <w:rFonts w:ascii="Times New Roman" w:hAnsi="Times New Roman" w:cs="Times New Roman"/>
-          <w:lang w:val="en-US"/>
-        </w:rPr>
-        <w:t>n chi</w:t>
-      </w:r>
-      <w:r>
-        <w:rPr>
-          <w:rFonts w:ascii="Times New Roman" w:hAnsi="Times New Roman" w:cs="Times New Roman"/>
-          <w:lang w:val="en-US"/>
-        </w:rPr>
-        <w:t>ế</w:t>
-      </w:r>
-      <w:r>
-        <w:rPr>
-          <w:rFonts w:ascii="Times New Roman" w:hAnsi="Times New Roman" w:cs="Times New Roman"/>
-          <w:lang w:val="en-US"/>
-        </w:rPr>
-        <w:t>n d</w:t>
-      </w:r>
-      <w:r>
-        <w:rPr>
-          <w:rFonts w:ascii="Times New Roman" w:hAnsi="Times New Roman" w:cs="Times New Roman"/>
-          <w:lang w:val="en-US"/>
-        </w:rPr>
-        <w:t>ị</w:t>
-      </w:r>
-      <w:r>
-        <w:rPr>
-          <w:rFonts w:ascii="Times New Roman" w:hAnsi="Times New Roman" w:cs="Times New Roman"/>
-          <w:lang w:val="en-US"/>
-        </w:rPr>
-        <w:t>ch xe th</w:t>
-      </w:r>
-      <w:r>
-        <w:rPr>
-          <w:rFonts w:ascii="Times New Roman" w:hAnsi="Times New Roman" w:cs="Times New Roman"/>
-          <w:lang w:val="en-US"/>
-        </w:rPr>
-        <w:t>ự</w:t>
-      </w:r>
-      <w:r>
-        <w:rPr>
-          <w:rFonts w:ascii="Times New Roman" w:hAnsi="Times New Roman" w:cs="Times New Roman"/>
-          <w:lang w:val="en-US"/>
-        </w:rPr>
-        <w:t>c hi</w:t>
-      </w:r>
-      <w:r>
-        <w:rPr>
-          <w:rFonts w:ascii="Times New Roman" w:hAnsi="Times New Roman" w:cs="Times New Roman"/>
-          <w:lang w:val="en-US"/>
-        </w:rPr>
-        <w:t>ệ</w:t>
-      </w:r>
-      <w:r>
-        <w:rPr>
-          <w:rFonts w:ascii="Times New Roman" w:hAnsi="Times New Roman" w:cs="Times New Roman"/>
-          <w:lang w:val="en-US"/>
-        </w:rPr>
-        <w:t>n l</w:t>
-      </w:r>
-      <w:r>
-        <w:rPr>
-          <w:rFonts w:ascii="Times New Roman" w:hAnsi="Times New Roman" w:cs="Times New Roman"/>
-          <w:lang w:val="en-US"/>
-        </w:rPr>
-        <w:t>ầ</w:t>
-      </w:r>
-      <w:r>
-        <w:rPr>
-          <w:rFonts w:ascii="Times New Roman" w:hAnsi="Times New Roman" w:cs="Times New Roman"/>
-          <w:lang w:val="en-US"/>
-        </w:rPr>
-        <w:t>n này (có th</w:t>
-      </w:r>
-      <w:r>
-        <w:rPr>
-          <w:rFonts w:ascii="Times New Roman" w:hAnsi="Times New Roman" w:cs="Times New Roman"/>
-          <w:lang w:val="en-US"/>
-        </w:rPr>
-        <w:t>ể</w:t>
-      </w:r>
-      <w:r>
-        <w:rPr>
-          <w:rFonts w:ascii="Times New Roman" w:hAnsi="Times New Roman" w:cs="Times New Roman"/>
-          <w:lang w:val="en-US"/>
-        </w:rPr>
-        <w:t xml:space="preserve"> ch</w:t>
-      </w:r>
-      <w:r>
-        <w:rPr>
-          <w:rFonts w:ascii="Times New Roman" w:hAnsi="Times New Roman" w:cs="Times New Roman"/>
-          <w:lang w:val="en-US"/>
-        </w:rPr>
-        <w:t>ọ</w:t>
-      </w:r>
-      <w:r>
-        <w:rPr>
-          <w:rFonts w:ascii="Times New Roman" w:hAnsi="Times New Roman" w:cs="Times New Roman"/>
-          <w:lang w:val="en-US"/>
-        </w:rPr>
-        <w:t>n nhi</w:t>
-      </w:r>
-      <w:r>
-        <w:rPr>
-          <w:rFonts w:ascii="Times New Roman" w:hAnsi="Times New Roman" w:cs="Times New Roman"/>
-          <w:lang w:val="en-US"/>
-        </w:rPr>
-        <w:t>ề</w:t>
-      </w:r>
-      <w:r>
-        <w:rPr>
-          <w:rFonts w:ascii="Times New Roman" w:hAnsi="Times New Roman" w:cs="Times New Roman"/>
-          <w:lang w:val="en-US"/>
-        </w:rPr>
-        <w:t>u chi</w:t>
-      </w:r>
-      <w:r>
-        <w:rPr>
-          <w:rFonts w:ascii="Times New Roman" w:hAnsi="Times New Roman" w:cs="Times New Roman"/>
-          <w:lang w:val="en-US"/>
-        </w:rPr>
-        <w:t>ế</w:t>
-      </w:r>
-      <w:r>
-        <w:rPr>
-          <w:rFonts w:ascii="Times New Roman" w:hAnsi="Times New Roman" w:cs="Times New Roman"/>
-          <w:lang w:val="en-US"/>
-        </w:rPr>
-        <w:t>n d</w:t>
-      </w:r>
-      <w:r>
-        <w:rPr>
-          <w:rFonts w:ascii="Times New Roman" w:hAnsi="Times New Roman" w:cs="Times New Roman"/>
-          <w:lang w:val="en-US"/>
-        </w:rPr>
-        <w:t>ị</w:t>
-      </w:r>
-      <w:r>
-        <w:rPr>
-          <w:rFonts w:ascii="Times New Roman" w:hAnsi="Times New Roman" w:cs="Times New Roman"/>
-          <w:lang w:val="en-US"/>
-        </w:rPr>
-        <w:t>ch), sau đó click “Ch</w:t>
-      </w:r>
-      <w:r>
-        <w:rPr>
-          <w:rFonts w:ascii="Times New Roman" w:hAnsi="Times New Roman" w:cs="Times New Roman"/>
-          <w:lang w:val="en-US"/>
-        </w:rPr>
-        <w:t>ấ</w:t>
-      </w:r>
-      <w:r>
-        <w:rPr>
-          <w:rFonts w:ascii="Times New Roman" w:hAnsi="Times New Roman" w:cs="Times New Roman"/>
-          <w:lang w:val="en-US"/>
-        </w:rPr>
-        <w:t>p nh</w:t>
-      </w:r>
-      <w:r>
-        <w:rPr>
-          <w:rFonts w:ascii="Times New Roman" w:hAnsi="Times New Roman" w:cs="Times New Roman"/>
-          <w:lang w:val="en-US"/>
-        </w:rPr>
-        <w:t>ậ</w:t>
-      </w:r>
-      <w:r>
-        <w:rPr>
-          <w:rFonts w:ascii="Times New Roman" w:hAnsi="Times New Roman" w:cs="Times New Roman"/>
-          <w:lang w:val="en-US"/>
-        </w:rPr>
-        <w:t>n”.</w:t>
+        <w:t>User tích chọn chiến dịch xe thực hiện lần này (có thể chọn nhiều chiến dịch), sau đó click “Chấp nhận”.</w:t>
       </w:r>
     </w:p>
     <w:p>
@@ -5616,189 +4292,7 @@
           <w:rFonts w:ascii="Times New Roman" w:hAnsi="Times New Roman" w:cs="Times New Roman"/>
           <w:lang w:val="en-US"/>
         </w:rPr>
-        <w:t>Mã chi</w:t>
-      </w:r>
-      <w:r>
-        <w:rPr>
-          <w:rFonts w:ascii="Times New Roman" w:hAnsi="Times New Roman" w:cs="Times New Roman"/>
-          <w:lang w:val="en-US"/>
-        </w:rPr>
-        <w:t>ế</w:t>
-      </w:r>
-      <w:r>
-        <w:rPr>
-          <w:rFonts w:ascii="Times New Roman" w:hAnsi="Times New Roman" w:cs="Times New Roman"/>
-          <w:lang w:val="en-US"/>
-        </w:rPr>
-        <w:t>n d</w:t>
-      </w:r>
-      <w:r>
-        <w:rPr>
-          <w:rFonts w:ascii="Times New Roman" w:hAnsi="Times New Roman" w:cs="Times New Roman"/>
-          <w:lang w:val="en-US"/>
-        </w:rPr>
-        <w:t>ị</w:t>
-      </w:r>
-      <w:r>
-        <w:rPr>
-          <w:rFonts w:ascii="Times New Roman" w:hAnsi="Times New Roman" w:cs="Times New Roman"/>
-          <w:lang w:val="en-US"/>
-        </w:rPr>
-        <w:t>ch hi</w:t>
-      </w:r>
-      <w:r>
-        <w:rPr>
-          <w:rFonts w:ascii="Times New Roman" w:hAnsi="Times New Roman" w:cs="Times New Roman"/>
-          <w:lang w:val="en-US"/>
-        </w:rPr>
-        <w:t>ể</w:t>
-      </w:r>
-      <w:r>
-        <w:rPr>
-          <w:rFonts w:ascii="Times New Roman" w:hAnsi="Times New Roman" w:cs="Times New Roman"/>
-          <w:lang w:val="en-US"/>
-        </w:rPr>
-        <w:t>n th</w:t>
-      </w:r>
-      <w:r>
-        <w:rPr>
-          <w:rFonts w:ascii="Times New Roman" w:hAnsi="Times New Roman" w:cs="Times New Roman"/>
-          <w:lang w:val="en-US"/>
-        </w:rPr>
-        <w:t>ị</w:t>
-      </w:r>
-      <w:r>
-        <w:rPr>
-          <w:rFonts w:ascii="Times New Roman" w:hAnsi="Times New Roman" w:cs="Times New Roman"/>
-          <w:lang w:val="en-US"/>
-        </w:rPr>
-        <w:t xml:space="preserve"> t</w:t>
-      </w:r>
-      <w:r>
-        <w:rPr>
-          <w:rFonts w:ascii="Times New Roman" w:hAnsi="Times New Roman" w:cs="Times New Roman"/>
-          <w:lang w:val="en-US"/>
-        </w:rPr>
-        <w:t>ạ</w:t>
-      </w:r>
-      <w:r>
-        <w:rPr>
-          <w:rFonts w:ascii="Times New Roman" w:hAnsi="Times New Roman" w:cs="Times New Roman"/>
-          <w:lang w:val="en-US"/>
-        </w:rPr>
-        <w:t>i ô “Chi</w:t>
-      </w:r>
-      <w:r>
-        <w:rPr>
-          <w:rFonts w:ascii="Times New Roman" w:hAnsi="Times New Roman" w:cs="Times New Roman"/>
-          <w:lang w:val="en-US"/>
-        </w:rPr>
-        <w:t>ế</w:t>
-      </w:r>
-      <w:r>
-        <w:rPr>
-          <w:rFonts w:ascii="Times New Roman" w:hAnsi="Times New Roman" w:cs="Times New Roman"/>
-          <w:lang w:val="en-US"/>
-        </w:rPr>
-        <w:t>n d</w:t>
-      </w:r>
-      <w:r>
-        <w:rPr>
-          <w:rFonts w:ascii="Times New Roman" w:hAnsi="Times New Roman" w:cs="Times New Roman"/>
-          <w:lang w:val="en-US"/>
-        </w:rPr>
-        <w:t>ị</w:t>
-      </w:r>
-      <w:r>
-        <w:rPr>
-          <w:rFonts w:ascii="Times New Roman" w:hAnsi="Times New Roman" w:cs="Times New Roman"/>
-          <w:lang w:val="en-US"/>
-        </w:rPr>
-        <w:t>ch”, nhi</w:t>
-      </w:r>
-      <w:r>
-        <w:rPr>
-          <w:rFonts w:ascii="Times New Roman" w:hAnsi="Times New Roman" w:cs="Times New Roman"/>
-          <w:lang w:val="en-US"/>
-        </w:rPr>
-        <w:t>ề</w:t>
-      </w:r>
-      <w:r>
-        <w:rPr>
-          <w:rFonts w:ascii="Times New Roman" w:hAnsi="Times New Roman" w:cs="Times New Roman"/>
-          <w:lang w:val="en-US"/>
-        </w:rPr>
-        <w:t>u chi</w:t>
-      </w:r>
-      <w:r>
-        <w:rPr>
-          <w:rFonts w:ascii="Times New Roman" w:hAnsi="Times New Roman" w:cs="Times New Roman"/>
-          <w:lang w:val="en-US"/>
-        </w:rPr>
-        <w:t>ế</w:t>
-      </w:r>
-      <w:r>
-        <w:rPr>
-          <w:rFonts w:ascii="Times New Roman" w:hAnsi="Times New Roman" w:cs="Times New Roman"/>
-          <w:lang w:val="en-US"/>
-        </w:rPr>
-        <w:t>n d</w:t>
-      </w:r>
-      <w:r>
-        <w:rPr>
-          <w:rFonts w:ascii="Times New Roman" w:hAnsi="Times New Roman" w:cs="Times New Roman"/>
-          <w:lang w:val="en-US"/>
-        </w:rPr>
-        <w:t>ị</w:t>
-      </w:r>
-      <w:r>
-        <w:rPr>
-          <w:rFonts w:ascii="Times New Roman" w:hAnsi="Times New Roman" w:cs="Times New Roman"/>
-          <w:lang w:val="en-US"/>
-        </w:rPr>
-        <w:t>ch thì cách nhau b</w:t>
-      </w:r>
-      <w:r>
-        <w:rPr>
-          <w:rFonts w:ascii="Times New Roman" w:hAnsi="Times New Roman" w:cs="Times New Roman"/>
-          <w:lang w:val="en-US"/>
-        </w:rPr>
-        <w:t>ằ</w:t>
-      </w:r>
-      <w:r>
-        <w:rPr>
-          <w:rFonts w:ascii="Times New Roman" w:hAnsi="Times New Roman" w:cs="Times New Roman"/>
-          <w:lang w:val="en-US"/>
-        </w:rPr>
-        <w:t>ng d</w:t>
-      </w:r>
-      <w:r>
-        <w:rPr>
-          <w:rFonts w:ascii="Times New Roman" w:hAnsi="Times New Roman" w:cs="Times New Roman"/>
-          <w:lang w:val="en-US"/>
-        </w:rPr>
-        <w:t>ấ</w:t>
-      </w:r>
-      <w:r>
-        <w:rPr>
-          <w:rFonts w:ascii="Times New Roman" w:hAnsi="Times New Roman" w:cs="Times New Roman"/>
-          <w:lang w:val="en-US"/>
-        </w:rPr>
-        <w:t>u ph</w:t>
-      </w:r>
-      <w:r>
-        <w:rPr>
-          <w:rFonts w:ascii="Times New Roman" w:hAnsi="Times New Roman" w:cs="Times New Roman"/>
-          <w:lang w:val="en-US"/>
-        </w:rPr>
-        <w:t>ẩ</w:t>
-      </w:r>
-      <w:r>
-        <w:rPr>
-          <w:rFonts w:ascii="Times New Roman" w:hAnsi="Times New Roman" w:cs="Times New Roman"/>
-          <w:lang w:val="en-US"/>
-        </w:rPr>
-        <w:t>y.</w:t>
+        <w:t>Mã chiến dịch hiển thị tại ô “Chiến dịch”, nhiều chiến dịch thì cách nhau bằng dấu phẩy.</w:t>
       </w:r>
     </w:p>
     <w:p>
@@ -5915,63 +4409,7 @@
           <w:rFonts w:ascii="Times New Roman" w:hAnsi="Times New Roman" w:cs="Times New Roman"/>
           <w:lang w:val="en-US"/>
         </w:rPr>
-        <w:t xml:space="preserve"> đ</w:t>
-      </w:r>
-      <w:r>
-        <w:rPr>
-          <w:rFonts w:ascii="Times New Roman" w:hAnsi="Times New Roman" w:cs="Times New Roman"/>
-          <w:lang w:val="en-US"/>
-        </w:rPr>
-        <w:t>ể</w:t>
-      </w:r>
-      <w:r>
-        <w:rPr>
-          <w:rFonts w:ascii="Times New Roman" w:hAnsi="Times New Roman" w:cs="Times New Roman"/>
-          <w:lang w:val="en-US"/>
-        </w:rPr>
-        <w:t xml:space="preserve"> hoàn t</w:t>
-      </w:r>
-      <w:r>
-        <w:rPr>
-          <w:rFonts w:ascii="Times New Roman" w:hAnsi="Times New Roman" w:cs="Times New Roman"/>
-          <w:lang w:val="en-US"/>
-        </w:rPr>
-        <w:t>ấ</w:t>
-      </w:r>
-      <w:r>
-        <w:rPr>
-          <w:rFonts w:ascii="Times New Roman" w:hAnsi="Times New Roman" w:cs="Times New Roman"/>
-          <w:lang w:val="en-US"/>
-        </w:rPr>
-        <w:t>t vi</w:t>
-      </w:r>
-      <w:r>
-        <w:rPr>
-          <w:rFonts w:ascii="Times New Roman" w:hAnsi="Times New Roman" w:cs="Times New Roman"/>
-          <w:lang w:val="en-US"/>
-        </w:rPr>
-        <w:t>ệ</w:t>
-      </w:r>
-      <w:r>
-        <w:rPr>
-          <w:rFonts w:ascii="Times New Roman" w:hAnsi="Times New Roman" w:cs="Times New Roman"/>
-          <w:lang w:val="en-US"/>
-        </w:rPr>
-        <w:t>c lưu phi</w:t>
-      </w:r>
-      <w:r>
-        <w:rPr>
-          <w:rFonts w:ascii="Times New Roman" w:hAnsi="Times New Roman" w:cs="Times New Roman"/>
-          <w:lang w:val="en-US"/>
-        </w:rPr>
-        <w:t>ế</w:t>
-      </w:r>
-      <w:r>
-        <w:rPr>
-          <w:rFonts w:ascii="Times New Roman" w:hAnsi="Times New Roman" w:cs="Times New Roman"/>
-          <w:lang w:val="en-US"/>
-        </w:rPr>
-        <w:t>u.</w:t>
+        <w:t xml:space="preserve"> để hoàn tất việc lưu phiếu.</w:t>
       </w:r>
     </w:p>
     <w:p>
@@ -6013,77 +4451,7 @@
           <w:rFonts w:ascii="Times New Roman" w:hAnsi="Times New Roman" w:cs="Times New Roman"/>
           <w:lang w:val="en-US"/>
         </w:rPr>
-        <w:t>Không gõ tay đư</w:t>
-      </w:r>
-      <w:r>
-        <w:rPr>
-          <w:rFonts w:ascii="Times New Roman" w:hAnsi="Times New Roman" w:cs="Times New Roman"/>
-          <w:lang w:val="en-US"/>
-        </w:rPr>
-        <w:t>ợ</w:t>
-      </w:r>
-      <w:r>
-        <w:rPr>
-          <w:rFonts w:ascii="Times New Roman" w:hAnsi="Times New Roman" w:cs="Times New Roman"/>
-          <w:lang w:val="en-US"/>
-        </w:rPr>
-        <w:t>c mã chi</w:t>
-      </w:r>
-      <w:r>
-        <w:rPr>
-          <w:rFonts w:ascii="Times New Roman" w:hAnsi="Times New Roman" w:cs="Times New Roman"/>
-          <w:lang w:val="en-US"/>
-        </w:rPr>
-        <w:t>ế</w:t>
-      </w:r>
-      <w:r>
-        <w:rPr>
-          <w:rFonts w:ascii="Times New Roman" w:hAnsi="Times New Roman" w:cs="Times New Roman"/>
-          <w:lang w:val="en-US"/>
-        </w:rPr>
-        <w:t>n d</w:t>
-      </w:r>
-      <w:r>
-        <w:rPr>
-          <w:rFonts w:ascii="Times New Roman" w:hAnsi="Times New Roman" w:cs="Times New Roman"/>
-          <w:lang w:val="en-US"/>
-        </w:rPr>
-        <w:t>ị</w:t>
-      </w:r>
-      <w:r>
-        <w:rPr>
-          <w:rFonts w:ascii="Times New Roman" w:hAnsi="Times New Roman" w:cs="Times New Roman"/>
-          <w:lang w:val="en-US"/>
-        </w:rPr>
-        <w:t>ch, ch</w:t>
-      </w:r>
-      <w:r>
-        <w:rPr>
-          <w:rFonts w:ascii="Times New Roman" w:hAnsi="Times New Roman" w:cs="Times New Roman"/>
-          <w:lang w:val="en-US"/>
-        </w:rPr>
-        <w:t>ỉ</w:t>
-      </w:r>
-      <w:r>
-        <w:rPr>
-          <w:rFonts w:ascii="Times New Roman" w:hAnsi="Times New Roman" w:cs="Times New Roman"/>
-          <w:lang w:val="en-US"/>
-        </w:rPr>
-        <w:t xml:space="preserve"> ch</w:t>
-      </w:r>
-      <w:r>
-        <w:rPr>
-          <w:rFonts w:ascii="Times New Roman" w:hAnsi="Times New Roman" w:cs="Times New Roman"/>
-          <w:lang w:val="en-US"/>
-        </w:rPr>
-        <w:t>ọ</w:t>
-      </w:r>
-      <w:r>
-        <w:rPr>
-          <w:rFonts w:ascii="Times New Roman" w:hAnsi="Times New Roman" w:cs="Times New Roman"/>
-          <w:lang w:val="en-US"/>
-        </w:rPr>
-        <w:t>n qua nút “...”.</w:t>
+        <w:t>Không gõ tay được mã chiến dịch, chỉ chọn qua nút “...”.</w:t>
       </w:r>
     </w:p>
     <w:p>
@@ -6103,245 +4471,7 @@
           <w:rFonts w:ascii="Times New Roman" w:hAnsi="Times New Roman" w:cs="Times New Roman"/>
           <w:lang w:val="en-US"/>
         </w:rPr>
-        <w:t>Ph</w:t>
-      </w:r>
-      <w:r>
-        <w:rPr>
-          <w:rFonts w:ascii="Times New Roman" w:hAnsi="Times New Roman" w:cs="Times New Roman"/>
-          <w:lang w:val="en-US"/>
-        </w:rPr>
-        <w:t>ả</w:t>
-      </w:r>
-      <w:r>
-        <w:rPr>
-          <w:rFonts w:ascii="Times New Roman" w:hAnsi="Times New Roman" w:cs="Times New Roman"/>
-          <w:lang w:val="en-US"/>
-        </w:rPr>
-        <w:t>i có s</w:t>
-      </w:r>
-      <w:r>
-        <w:rPr>
-          <w:rFonts w:ascii="Times New Roman" w:hAnsi="Times New Roman" w:cs="Times New Roman"/>
-          <w:lang w:val="en-US"/>
-        </w:rPr>
-        <w:t>ố</w:t>
-      </w:r>
-      <w:r>
-        <w:rPr>
-          <w:rFonts w:ascii="Times New Roman" w:hAnsi="Times New Roman" w:cs="Times New Roman"/>
-          <w:lang w:val="en-US"/>
-        </w:rPr>
-        <w:t xml:space="preserve"> khung trư</w:t>
-      </w:r>
-      <w:r>
-        <w:rPr>
-          <w:rFonts w:ascii="Times New Roman" w:hAnsi="Times New Roman" w:cs="Times New Roman"/>
-          <w:lang w:val="en-US"/>
-        </w:rPr>
-        <w:t>ớ</w:t>
-      </w:r>
-      <w:r>
-        <w:rPr>
-          <w:rFonts w:ascii="Times New Roman" w:hAnsi="Times New Roman" w:cs="Times New Roman"/>
-          <w:lang w:val="en-US"/>
-        </w:rPr>
-        <w:t>c khi ch</w:t>
-      </w:r>
-      <w:r>
-        <w:rPr>
-          <w:rFonts w:ascii="Times New Roman" w:hAnsi="Times New Roman" w:cs="Times New Roman"/>
-          <w:lang w:val="en-US"/>
-        </w:rPr>
-        <w:t>ọ</w:t>
-      </w:r>
-      <w:r>
-        <w:rPr>
-          <w:rFonts w:ascii="Times New Roman" w:hAnsi="Times New Roman" w:cs="Times New Roman"/>
-          <w:lang w:val="en-US"/>
-        </w:rPr>
-        <w:t>n. Đ</w:t>
-      </w:r>
-      <w:r>
-        <w:rPr>
-          <w:rFonts w:ascii="Times New Roman" w:hAnsi="Times New Roman" w:cs="Times New Roman"/>
-          <w:lang w:val="en-US"/>
-        </w:rPr>
-        <w:t>ể</w:t>
-      </w:r>
-      <w:r>
-        <w:rPr>
-          <w:rFonts w:ascii="Times New Roman" w:hAnsi="Times New Roman" w:cs="Times New Roman"/>
-          <w:lang w:val="en-US"/>
-        </w:rPr>
-        <w:t xml:space="preserve"> tr</w:t>
-      </w:r>
-      <w:r>
-        <w:rPr>
-          <w:rFonts w:ascii="Times New Roman" w:hAnsi="Times New Roman" w:cs="Times New Roman"/>
-          <w:lang w:val="en-US"/>
-        </w:rPr>
-        <w:t>ố</w:t>
-      </w:r>
-      <w:r>
-        <w:rPr>
-          <w:rFonts w:ascii="Times New Roman" w:hAnsi="Times New Roman" w:cs="Times New Roman"/>
-          <w:lang w:val="en-US"/>
-        </w:rPr>
-        <w:t>ng s</w:t>
-      </w:r>
-      <w:r>
-        <w:rPr>
-          <w:rFonts w:ascii="Times New Roman" w:hAnsi="Times New Roman" w:cs="Times New Roman"/>
-          <w:lang w:val="en-US"/>
-        </w:rPr>
-        <w:t>ố</w:t>
-      </w:r>
-      <w:r>
-        <w:rPr>
-          <w:rFonts w:ascii="Times New Roman" w:hAnsi="Times New Roman" w:cs="Times New Roman"/>
-          <w:lang w:val="en-US"/>
-        </w:rPr>
-        <w:t xml:space="preserve"> khung, h</w:t>
-      </w:r>
-      <w:r>
-        <w:rPr>
-          <w:rFonts w:ascii="Times New Roman" w:hAnsi="Times New Roman" w:cs="Times New Roman"/>
-          <w:lang w:val="en-US"/>
-        </w:rPr>
-        <w:t>ệ</w:t>
-      </w:r>
-      <w:r>
-        <w:rPr>
-          <w:rFonts w:ascii="Times New Roman" w:hAnsi="Times New Roman" w:cs="Times New Roman"/>
-          <w:lang w:val="en-US"/>
-        </w:rPr>
-        <w:t xml:space="preserve"> th</w:t>
-      </w:r>
-      <w:r>
-        <w:rPr>
-          <w:rFonts w:ascii="Times New Roman" w:hAnsi="Times New Roman" w:cs="Times New Roman"/>
-          <w:lang w:val="en-US"/>
-        </w:rPr>
-        <w:t>ố</w:t>
-      </w:r>
-      <w:r>
-        <w:rPr>
-          <w:rFonts w:ascii="Times New Roman" w:hAnsi="Times New Roman" w:cs="Times New Roman"/>
-          <w:lang w:val="en-US"/>
-        </w:rPr>
-        <w:t>ng s</w:t>
-      </w:r>
-      <w:r>
-        <w:rPr>
-          <w:rFonts w:ascii="Times New Roman" w:hAnsi="Times New Roman" w:cs="Times New Roman"/>
-          <w:lang w:val="en-US"/>
-        </w:rPr>
-        <w:t>ẽ</w:t>
-      </w:r>
-      <w:r>
-        <w:rPr>
-          <w:rFonts w:ascii="Times New Roman" w:hAnsi="Times New Roman" w:cs="Times New Roman"/>
-          <w:lang w:val="en-US"/>
-        </w:rPr>
-        <w:t xml:space="preserve"> hi</w:t>
-      </w:r>
-      <w:r>
-        <w:rPr>
-          <w:rFonts w:ascii="Times New Roman" w:hAnsi="Times New Roman" w:cs="Times New Roman"/>
-          <w:lang w:val="en-US"/>
-        </w:rPr>
-        <w:t>ể</w:t>
-      </w:r>
-      <w:r>
-        <w:rPr>
-          <w:rFonts w:ascii="Times New Roman" w:hAnsi="Times New Roman" w:cs="Times New Roman"/>
-          <w:lang w:val="en-US"/>
-        </w:rPr>
-        <w:t>n th</w:t>
-      </w:r>
-      <w:r>
-        <w:rPr>
-          <w:rFonts w:ascii="Times New Roman" w:hAnsi="Times New Roman" w:cs="Times New Roman"/>
-          <w:lang w:val="en-US"/>
-        </w:rPr>
-        <w:t>ị</w:t>
-      </w:r>
-      <w:r>
-        <w:rPr>
-          <w:rFonts w:ascii="Times New Roman" w:hAnsi="Times New Roman" w:cs="Times New Roman"/>
-          <w:lang w:val="en-US"/>
-        </w:rPr>
-        <w:t xml:space="preserve"> m</w:t>
-      </w:r>
-      <w:r>
-        <w:rPr>
-          <w:rFonts w:ascii="Times New Roman" w:hAnsi="Times New Roman" w:cs="Times New Roman"/>
-          <w:lang w:val="en-US"/>
-        </w:rPr>
-        <w:t>ọ</w:t>
-      </w:r>
-      <w:r>
-        <w:rPr>
-          <w:rFonts w:ascii="Times New Roman" w:hAnsi="Times New Roman" w:cs="Times New Roman"/>
-          <w:lang w:val="en-US"/>
-        </w:rPr>
-        <w:t>i chi</w:t>
-      </w:r>
-      <w:r>
-        <w:rPr>
-          <w:rFonts w:ascii="Times New Roman" w:hAnsi="Times New Roman" w:cs="Times New Roman"/>
-          <w:lang w:val="en-US"/>
-        </w:rPr>
-        <w:t>ế</w:t>
-      </w:r>
-      <w:r>
-        <w:rPr>
-          <w:rFonts w:ascii="Times New Roman" w:hAnsi="Times New Roman" w:cs="Times New Roman"/>
-          <w:lang w:val="en-US"/>
-        </w:rPr>
-        <w:t>n d</w:t>
-      </w:r>
-      <w:r>
-        <w:rPr>
-          <w:rFonts w:ascii="Times New Roman" w:hAnsi="Times New Roman" w:cs="Times New Roman"/>
-          <w:lang w:val="en-US"/>
-        </w:rPr>
-        <w:t>ị</w:t>
-      </w:r>
-      <w:r>
-        <w:rPr>
-          <w:rFonts w:ascii="Times New Roman" w:hAnsi="Times New Roman" w:cs="Times New Roman"/>
-          <w:lang w:val="en-US"/>
-        </w:rPr>
-        <w:t>ch c</w:t>
-      </w:r>
-      <w:r>
-        <w:rPr>
-          <w:rFonts w:ascii="Times New Roman" w:hAnsi="Times New Roman" w:cs="Times New Roman"/>
-          <w:lang w:val="en-US"/>
-        </w:rPr>
-        <w:t>ủ</w:t>
-      </w:r>
-      <w:r>
-        <w:rPr>
-          <w:rFonts w:ascii="Times New Roman" w:hAnsi="Times New Roman" w:cs="Times New Roman"/>
-          <w:lang w:val="en-US"/>
-        </w:rPr>
-        <w:t>a đơn v</w:t>
-      </w:r>
-      <w:r>
-        <w:rPr>
-          <w:rFonts w:ascii="Times New Roman" w:hAnsi="Times New Roman" w:cs="Times New Roman"/>
-          <w:lang w:val="en-US"/>
-        </w:rPr>
-        <w:t>ị</w:t>
-      </w:r>
-      <w:r>
-        <w:rPr>
-          <w:rFonts w:ascii="Times New Roman" w:hAnsi="Times New Roman" w:cs="Times New Roman"/>
-          <w:lang w:val="en-US"/>
-        </w:rPr>
-        <w:t>.</w:t>
+        <w:t>Phải có số khung trước khi chọn. Để trống số khung, hệ thống sẽ hiển thị mọi chiến dịch của đơn vị.</w:t>
       </w:r>
     </w:p>
     <w:p>
@@ -6361,133 +4491,7 @@
           <w:rFonts w:ascii="Times New Roman" w:hAnsi="Times New Roman" w:cs="Times New Roman"/>
           <w:lang w:val="en-US"/>
         </w:rPr>
-        <w:t>H</w:t>
-      </w:r>
-      <w:r>
-        <w:rPr>
-          <w:rFonts w:ascii="Times New Roman" w:hAnsi="Times New Roman" w:cs="Times New Roman"/>
-          <w:lang w:val="en-US"/>
-        </w:rPr>
-        <w:t>ệ</w:t>
-      </w:r>
-      <w:r>
-        <w:rPr>
-          <w:rFonts w:ascii="Times New Roman" w:hAnsi="Times New Roman" w:cs="Times New Roman"/>
-          <w:lang w:val="en-US"/>
-        </w:rPr>
-        <w:t xml:space="preserve"> th</w:t>
-      </w:r>
-      <w:r>
-        <w:rPr>
-          <w:rFonts w:ascii="Times New Roman" w:hAnsi="Times New Roman" w:cs="Times New Roman"/>
-          <w:lang w:val="en-US"/>
-        </w:rPr>
-        <w:t>ố</w:t>
-      </w:r>
-      <w:r>
-        <w:rPr>
-          <w:rFonts w:ascii="Times New Roman" w:hAnsi="Times New Roman" w:cs="Times New Roman"/>
-          <w:lang w:val="en-US"/>
-        </w:rPr>
-        <w:t>ng ch</w:t>
-      </w:r>
-      <w:r>
-        <w:rPr>
-          <w:rFonts w:ascii="Times New Roman" w:hAnsi="Times New Roman" w:cs="Times New Roman"/>
-          <w:lang w:val="en-US"/>
-        </w:rPr>
-        <w:t>ỉ</w:t>
-      </w:r>
-      <w:r>
-        <w:rPr>
-          <w:rFonts w:ascii="Times New Roman" w:hAnsi="Times New Roman" w:cs="Times New Roman"/>
-          <w:lang w:val="en-US"/>
-        </w:rPr>
-        <w:t xml:space="preserve"> hi</w:t>
-      </w:r>
-      <w:r>
-        <w:rPr>
-          <w:rFonts w:ascii="Times New Roman" w:hAnsi="Times New Roman" w:cs="Times New Roman"/>
-          <w:lang w:val="en-US"/>
-        </w:rPr>
-        <w:t>ể</w:t>
-      </w:r>
-      <w:r>
-        <w:rPr>
-          <w:rFonts w:ascii="Times New Roman" w:hAnsi="Times New Roman" w:cs="Times New Roman"/>
-          <w:lang w:val="en-US"/>
-        </w:rPr>
-        <w:t>n th</w:t>
-      </w:r>
-      <w:r>
-        <w:rPr>
-          <w:rFonts w:ascii="Times New Roman" w:hAnsi="Times New Roman" w:cs="Times New Roman"/>
-          <w:lang w:val="en-US"/>
-        </w:rPr>
-        <w:t>ị</w:t>
-      </w:r>
-      <w:r>
-        <w:rPr>
-          <w:rFonts w:ascii="Times New Roman" w:hAnsi="Times New Roman" w:cs="Times New Roman"/>
-          <w:lang w:val="en-US"/>
-        </w:rPr>
-        <w:t xml:space="preserve"> các chi</w:t>
-      </w:r>
-      <w:r>
-        <w:rPr>
-          <w:rFonts w:ascii="Times New Roman" w:hAnsi="Times New Roman" w:cs="Times New Roman"/>
-          <w:lang w:val="en-US"/>
-        </w:rPr>
-        <w:t>ế</w:t>
-      </w:r>
-      <w:r>
-        <w:rPr>
-          <w:rFonts w:ascii="Times New Roman" w:hAnsi="Times New Roman" w:cs="Times New Roman"/>
-          <w:lang w:val="en-US"/>
-        </w:rPr>
-        <w:t>n d</w:t>
-      </w:r>
-      <w:r>
-        <w:rPr>
-          <w:rFonts w:ascii="Times New Roman" w:hAnsi="Times New Roman" w:cs="Times New Roman"/>
-          <w:lang w:val="en-US"/>
-        </w:rPr>
-        <w:t>ị</w:t>
-      </w:r>
-      <w:r>
-        <w:rPr>
-          <w:rFonts w:ascii="Times New Roman" w:hAnsi="Times New Roman" w:cs="Times New Roman"/>
-          <w:lang w:val="en-US"/>
-        </w:rPr>
-        <w:t>ch đăng ký theo s</w:t>
-      </w:r>
-      <w:r>
-        <w:rPr>
-          <w:rFonts w:ascii="Times New Roman" w:hAnsi="Times New Roman" w:cs="Times New Roman"/>
-          <w:lang w:val="en-US"/>
-        </w:rPr>
-        <w:t>ố</w:t>
-      </w:r>
-      <w:r>
-        <w:rPr>
-          <w:rFonts w:ascii="Times New Roman" w:hAnsi="Times New Roman" w:cs="Times New Roman"/>
-          <w:lang w:val="en-US"/>
-        </w:rPr>
-        <w:t xml:space="preserve"> khung c</w:t>
-      </w:r>
-      <w:r>
-        <w:rPr>
-          <w:rFonts w:ascii="Times New Roman" w:hAnsi="Times New Roman" w:cs="Times New Roman"/>
-          <w:lang w:val="en-US"/>
-        </w:rPr>
-        <w:t>ủ</w:t>
-      </w:r>
-      <w:r>
-        <w:rPr>
-          <w:rFonts w:ascii="Times New Roman" w:hAnsi="Times New Roman" w:cs="Times New Roman"/>
-          <w:lang w:val="en-US"/>
-        </w:rPr>
-        <w:t xml:space="preserve">a xe và </w:t>
+        <w:t xml:space="preserve">Hệ thống chỉ hiển thị các chiến dịch đăng ký theo số khung của xe và </w:t>
       </w:r>
       <w:r>
         <w:rPr>
@@ -6496,204 +4500,14 @@
           <w:bCs/>
           <w:lang w:val="en-US"/>
         </w:rPr>
-        <w:t>còn hi</w:t>
-      </w:r>
-      <w:r>
-        <w:rPr>
-          <w:rFonts w:ascii="Times New Roman" w:hAnsi="Times New Roman" w:cs="Times New Roman"/>
-          <w:b/>
-          <w:bCs/>
-          <w:lang w:val="en-US"/>
-        </w:rPr>
-        <w:t>ệ</w:t>
-      </w:r>
-      <w:r>
-        <w:rPr>
-          <w:rFonts w:ascii="Times New Roman" w:hAnsi="Times New Roman" w:cs="Times New Roman"/>
-          <w:b/>
-          <w:bCs/>
-          <w:lang w:val="en-US"/>
-        </w:rPr>
-        <w:t>u l</w:t>
-      </w:r>
-      <w:r>
-        <w:rPr>
-          <w:rFonts w:ascii="Times New Roman" w:hAnsi="Times New Roman" w:cs="Times New Roman"/>
-          <w:b/>
-          <w:bCs/>
-          <w:lang w:val="en-US"/>
-        </w:rPr>
-        <w:t>ự</w:t>
-      </w:r>
-      <w:r>
-        <w:rPr>
-          <w:rFonts w:ascii="Times New Roman" w:hAnsi="Times New Roman" w:cs="Times New Roman"/>
-          <w:b/>
-          <w:bCs/>
-          <w:lang w:val="en-US"/>
-        </w:rPr>
-        <w:t>c</w:t>
-      </w:r>
-      <w:r>
-        <w:rPr>
-          <w:rFonts w:ascii="Times New Roman" w:hAnsi="Times New Roman" w:cs="Times New Roman"/>
-          <w:lang w:val="en-US"/>
-        </w:rPr>
-        <w:t>. Chi</w:t>
-      </w:r>
-      <w:r>
-        <w:rPr>
-          <w:rFonts w:ascii="Times New Roman" w:hAnsi="Times New Roman" w:cs="Times New Roman"/>
-          <w:lang w:val="en-US"/>
-        </w:rPr>
-        <w:t>ế</w:t>
-      </w:r>
-      <w:r>
-        <w:rPr>
-          <w:rFonts w:ascii="Times New Roman" w:hAnsi="Times New Roman" w:cs="Times New Roman"/>
-          <w:lang w:val="en-US"/>
-        </w:rPr>
-        <w:t>n d</w:t>
-      </w:r>
-      <w:r>
-        <w:rPr>
-          <w:rFonts w:ascii="Times New Roman" w:hAnsi="Times New Roman" w:cs="Times New Roman"/>
-          <w:lang w:val="en-US"/>
-        </w:rPr>
-        <w:t>ị</w:t>
-      </w:r>
-      <w:r>
-        <w:rPr>
-          <w:rFonts w:ascii="Times New Roman" w:hAnsi="Times New Roman" w:cs="Times New Roman"/>
-          <w:lang w:val="en-US"/>
-        </w:rPr>
-        <w:t>ch đã ch</w:t>
-      </w:r>
-      <w:r>
-        <w:rPr>
-          <w:rFonts w:ascii="Times New Roman" w:hAnsi="Times New Roman" w:cs="Times New Roman"/>
-          <w:lang w:val="en-US"/>
-        </w:rPr>
-        <w:t>ọ</w:t>
-      </w:r>
-      <w:r>
-        <w:rPr>
-          <w:rFonts w:ascii="Times New Roman" w:hAnsi="Times New Roman" w:cs="Times New Roman"/>
-          <w:lang w:val="en-US"/>
-        </w:rPr>
-        <w:t xml:space="preserve">n </w:t>
-      </w:r>
-      <w:r>
-        <w:rPr>
-          <w:rFonts w:ascii="Times New Roman" w:hAnsi="Times New Roman" w:cs="Times New Roman"/>
-          <w:lang w:val="en-US"/>
-        </w:rPr>
-        <w:t>ở</w:t>
-      </w:r>
-      <w:r>
-        <w:rPr>
-          <w:rFonts w:ascii="Times New Roman" w:hAnsi="Times New Roman" w:cs="Times New Roman"/>
-          <w:lang w:val="en-US"/>
-        </w:rPr>
-        <w:t xml:space="preserve"> m</w:t>
-      </w:r>
-      <w:r>
-        <w:rPr>
-          <w:rFonts w:ascii="Times New Roman" w:hAnsi="Times New Roman" w:cs="Times New Roman"/>
-          <w:lang w:val="en-US"/>
-        </w:rPr>
-        <w:t>ộ</w:t>
-      </w:r>
-      <w:r>
-        <w:rPr>
-          <w:rFonts w:ascii="Times New Roman" w:hAnsi="Times New Roman" w:cs="Times New Roman"/>
-          <w:lang w:val="en-US"/>
-        </w:rPr>
-        <w:t>t l</w:t>
-      </w:r>
-      <w:r>
-        <w:rPr>
-          <w:rFonts w:ascii="Times New Roman" w:hAnsi="Times New Roman" w:cs="Times New Roman"/>
-          <w:lang w:val="en-US"/>
-        </w:rPr>
-        <w:t>ệ</w:t>
-      </w:r>
-      <w:r>
-        <w:rPr>
-          <w:rFonts w:ascii="Times New Roman" w:hAnsi="Times New Roman" w:cs="Times New Roman"/>
-          <w:lang w:val="en-US"/>
-        </w:rPr>
-        <w:t>nh khác c</w:t>
-      </w:r>
-      <w:r>
-        <w:rPr>
-          <w:rFonts w:ascii="Times New Roman" w:hAnsi="Times New Roman" w:cs="Times New Roman"/>
-          <w:lang w:val="en-US"/>
-        </w:rPr>
-        <w:t>ủ</w:t>
-      </w:r>
-      <w:r>
-        <w:rPr>
-          <w:rFonts w:ascii="Times New Roman" w:hAnsi="Times New Roman" w:cs="Times New Roman"/>
-          <w:lang w:val="en-US"/>
-        </w:rPr>
-        <w:t>a cùng xe s</w:t>
-      </w:r>
-      <w:r>
-        <w:rPr>
-          <w:rFonts w:ascii="Times New Roman" w:hAnsi="Times New Roman" w:cs="Times New Roman"/>
-          <w:lang w:val="en-US"/>
-        </w:rPr>
-        <w:t>ẽ</w:t>
-      </w:r>
-      <w:r>
-        <w:rPr>
-          <w:rFonts w:ascii="Times New Roman" w:hAnsi="Times New Roman" w:cs="Times New Roman"/>
-          <w:lang w:val="en-US"/>
-        </w:rPr>
-        <w:t xml:space="preserve"> không hi</w:t>
-      </w:r>
-      <w:r>
-        <w:rPr>
-          <w:rFonts w:ascii="Times New Roman" w:hAnsi="Times New Roman" w:cs="Times New Roman"/>
-          <w:lang w:val="en-US"/>
-        </w:rPr>
-        <w:t>ể</w:t>
-      </w:r>
-      <w:r>
-        <w:rPr>
-          <w:rFonts w:ascii="Times New Roman" w:hAnsi="Times New Roman" w:cs="Times New Roman"/>
-          <w:lang w:val="en-US"/>
-        </w:rPr>
-        <w:t>n th</w:t>
-      </w:r>
-      <w:r>
-        <w:rPr>
-          <w:rFonts w:ascii="Times New Roman" w:hAnsi="Times New Roman" w:cs="Times New Roman"/>
-          <w:lang w:val="en-US"/>
-        </w:rPr>
-        <w:t>ị</w:t>
-      </w:r>
-      <w:r>
-        <w:rPr>
-          <w:rFonts w:ascii="Times New Roman" w:hAnsi="Times New Roman" w:cs="Times New Roman"/>
-          <w:lang w:val="en-US"/>
-        </w:rPr>
-        <w:t xml:space="preserve"> l</w:t>
-      </w:r>
-      <w:r>
-        <w:rPr>
-          <w:rFonts w:ascii="Times New Roman" w:hAnsi="Times New Roman" w:cs="Times New Roman"/>
-          <w:lang w:val="en-US"/>
-        </w:rPr>
-        <w:t>ạ</w:t>
-      </w:r>
-      <w:r>
-        <w:rPr>
-          <w:rFonts w:ascii="Times New Roman" w:hAnsi="Times New Roman" w:cs="Times New Roman"/>
-          <w:lang w:val="en-US"/>
-        </w:rPr>
-        <w:t>i.</w:t>
+        <w:t>còn hiệu lực</w:t>
+      </w:r>
+      <w:r>
+        <w:rPr>
+          <w:rFonts w:ascii="Times New Roman" w:hAnsi="Times New Roman" w:cs="Times New Roman"/>
+          <w:lang w:val="en-US"/>
+        </w:rPr>
+        <w:t>. Chiến dịch đã chọn ở một lệnh khác của cùng xe sẽ không hiển thị lại.</w:t>
       </w:r>
     </w:p>
     <w:p>
@@ -6713,203 +4527,56 @@
           <w:rFonts w:ascii="Times New Roman" w:hAnsi="Times New Roman" w:cs="Times New Roman"/>
           <w:lang w:val="en-US"/>
         </w:rPr>
-        <w:t>Khi t</w:t>
-      </w:r>
-      <w:r>
-        <w:rPr>
-          <w:rFonts w:ascii="Times New Roman" w:hAnsi="Times New Roman" w:cs="Times New Roman"/>
-          <w:lang w:val="en-US"/>
-        </w:rPr>
-        <w:t>ạ</w:t>
-      </w:r>
-      <w:r>
-        <w:rPr>
-          <w:rFonts w:ascii="Times New Roman" w:hAnsi="Times New Roman" w:cs="Times New Roman"/>
-          <w:lang w:val="en-US"/>
-        </w:rPr>
-        <w:t>o l</w:t>
-      </w:r>
-      <w:r>
-        <w:rPr>
-          <w:rFonts w:ascii="Times New Roman" w:hAnsi="Times New Roman" w:cs="Times New Roman"/>
-          <w:lang w:val="en-US"/>
-        </w:rPr>
-        <w:t>ệ</w:t>
-      </w:r>
-      <w:r>
-        <w:rPr>
-          <w:rFonts w:ascii="Times New Roman" w:hAnsi="Times New Roman" w:cs="Times New Roman"/>
-          <w:lang w:val="en-US"/>
-        </w:rPr>
-        <w:t>nh ho</w:t>
-      </w:r>
-      <w:r>
-        <w:rPr>
-          <w:rFonts w:ascii="Times New Roman" w:hAnsi="Times New Roman" w:cs="Times New Roman"/>
-          <w:lang w:val="en-US"/>
-        </w:rPr>
-        <w:t>ặ</w:t>
-      </w:r>
-      <w:r>
-        <w:rPr>
-          <w:rFonts w:ascii="Times New Roman" w:hAnsi="Times New Roman" w:cs="Times New Roman"/>
-          <w:lang w:val="en-US"/>
-        </w:rPr>
-        <w:t>c import l</w:t>
-      </w:r>
-      <w:r>
-        <w:rPr>
-          <w:rFonts w:ascii="Times New Roman" w:hAnsi="Times New Roman" w:cs="Times New Roman"/>
-          <w:lang w:val="en-US"/>
-        </w:rPr>
-        <w:t>ệ</w:t>
-      </w:r>
-      <w:r>
-        <w:rPr>
-          <w:rFonts w:ascii="Times New Roman" w:hAnsi="Times New Roman" w:cs="Times New Roman"/>
-          <w:lang w:val="en-US"/>
-        </w:rPr>
-        <w:t>nh t</w:t>
-      </w:r>
-      <w:r>
-        <w:rPr>
-          <w:rFonts w:ascii="Times New Roman" w:hAnsi="Times New Roman" w:cs="Times New Roman"/>
-          <w:lang w:val="en-US"/>
-        </w:rPr>
-        <w:t>ừ</w:t>
-      </w:r>
-      <w:r>
-        <w:rPr>
-          <w:rFonts w:ascii="Times New Roman" w:hAnsi="Times New Roman" w:cs="Times New Roman"/>
-          <w:lang w:val="en-US"/>
-        </w:rPr>
-        <w:t xml:space="preserve"> DMS, n</w:t>
-      </w:r>
-      <w:r>
-        <w:rPr>
-          <w:rFonts w:ascii="Times New Roman" w:hAnsi="Times New Roman" w:cs="Times New Roman"/>
-          <w:lang w:val="en-US"/>
-        </w:rPr>
-        <w:t>ế</w:t>
-      </w:r>
-      <w:r>
-        <w:rPr>
-          <w:rFonts w:ascii="Times New Roman" w:hAnsi="Times New Roman" w:cs="Times New Roman"/>
-          <w:lang w:val="en-US"/>
-        </w:rPr>
-        <w:t>u xe có trong chi</w:t>
-      </w:r>
-      <w:r>
-        <w:rPr>
-          <w:rFonts w:ascii="Times New Roman" w:hAnsi="Times New Roman" w:cs="Times New Roman"/>
-          <w:lang w:val="en-US"/>
-        </w:rPr>
-        <w:t>ế</w:t>
-      </w:r>
-      <w:r>
-        <w:rPr>
-          <w:rFonts w:ascii="Times New Roman" w:hAnsi="Times New Roman" w:cs="Times New Roman"/>
-          <w:lang w:val="en-US"/>
-        </w:rPr>
-        <w:t>n d</w:t>
-      </w:r>
-      <w:r>
-        <w:rPr>
-          <w:rFonts w:ascii="Times New Roman" w:hAnsi="Times New Roman" w:cs="Times New Roman"/>
-          <w:lang w:val="en-US"/>
-        </w:rPr>
-        <w:t>ị</w:t>
-      </w:r>
-      <w:r>
-        <w:rPr>
-          <w:rFonts w:ascii="Times New Roman" w:hAnsi="Times New Roman" w:cs="Times New Roman"/>
-          <w:lang w:val="en-US"/>
-        </w:rPr>
-        <w:t>ch, h</w:t>
-      </w:r>
-      <w:r>
-        <w:rPr>
-          <w:rFonts w:ascii="Times New Roman" w:hAnsi="Times New Roman" w:cs="Times New Roman"/>
-          <w:lang w:val="en-US"/>
-        </w:rPr>
-        <w:t>ệ</w:t>
-      </w:r>
-      <w:r>
-        <w:rPr>
-          <w:rFonts w:ascii="Times New Roman" w:hAnsi="Times New Roman" w:cs="Times New Roman"/>
-          <w:lang w:val="en-US"/>
-        </w:rPr>
-        <w:t xml:space="preserve"> th</w:t>
-      </w:r>
-      <w:r>
-        <w:rPr>
-          <w:rFonts w:ascii="Times New Roman" w:hAnsi="Times New Roman" w:cs="Times New Roman"/>
-          <w:lang w:val="en-US"/>
-        </w:rPr>
-        <w:t>ố</w:t>
-      </w:r>
-      <w:r>
-        <w:rPr>
-          <w:rFonts w:ascii="Times New Roman" w:hAnsi="Times New Roman" w:cs="Times New Roman"/>
-          <w:lang w:val="en-US"/>
-        </w:rPr>
-        <w:t>ng s</w:t>
-      </w:r>
-      <w:r>
-        <w:rPr>
-          <w:rFonts w:ascii="Times New Roman" w:hAnsi="Times New Roman" w:cs="Times New Roman"/>
-          <w:lang w:val="en-US"/>
-        </w:rPr>
-        <w:t>ẽ</w:t>
-      </w:r>
-      <w:r>
-        <w:rPr>
-          <w:rFonts w:ascii="Times New Roman" w:hAnsi="Times New Roman" w:cs="Times New Roman"/>
-          <w:lang w:val="en-US"/>
-        </w:rPr>
-        <w:t xml:space="preserve"> hi</w:t>
-      </w:r>
-      <w:r>
-        <w:rPr>
-          <w:rFonts w:ascii="Times New Roman" w:hAnsi="Times New Roman" w:cs="Times New Roman"/>
-          <w:lang w:val="en-US"/>
-        </w:rPr>
-        <w:t>ể</w:t>
-      </w:r>
-      <w:r>
-        <w:rPr>
-          <w:rFonts w:ascii="Times New Roman" w:hAnsi="Times New Roman" w:cs="Times New Roman"/>
-          <w:lang w:val="en-US"/>
-        </w:rPr>
-        <w:t>n th</w:t>
-      </w:r>
-      <w:r>
-        <w:rPr>
-          <w:rFonts w:ascii="Times New Roman" w:hAnsi="Times New Roman" w:cs="Times New Roman"/>
-          <w:lang w:val="en-US"/>
-        </w:rPr>
-        <w:t>ị</w:t>
-      </w:r>
-      <w:r>
-        <w:rPr>
-          <w:rFonts w:ascii="Times New Roman" w:hAnsi="Times New Roman" w:cs="Times New Roman"/>
-          <w:lang w:val="en-US"/>
-        </w:rPr>
-        <w:t xml:space="preserve"> c</w:t>
-      </w:r>
-      <w:r>
-        <w:rPr>
-          <w:rFonts w:ascii="Times New Roman" w:hAnsi="Times New Roman" w:cs="Times New Roman"/>
-          <w:lang w:val="en-US"/>
-        </w:rPr>
-        <w:t>ả</w:t>
-      </w:r>
-      <w:r>
-        <w:rPr>
-          <w:rFonts w:ascii="Times New Roman" w:hAnsi="Times New Roman" w:cs="Times New Roman"/>
-          <w:lang w:val="en-US"/>
-        </w:rPr>
-        <w:t>nh báo cho CVDV.</w:t>
+        <w:t>Khi tạo lệnh hoặc import lệnh từ DMS, nếu xe có trong chiến dịch, hệ thống sẽ hiển thị cảnh báo cho CVDV.</w:t>
+      </w:r>
+    </w:p>
+    <w:p>
+      <w:pPr>
+        <w:rPr>
+          <w:rFonts w:ascii="Times New Roman" w:hAnsi="Times New Roman" w:cs="Times New Roman"/>
+          <w:lang w:val="en-US"/>
+        </w:rPr>
+      </w:pPr>
+      <w:r>
+        <w:rPr>
+          <w:rFonts w:ascii="Times New Roman" w:hAnsi="Times New Roman" w:cs="Times New Roman"/>
+          <w:lang w:val="en-GB" w:eastAsia="zh-CN"/>
+        </w:rPr>
+        <w:drawing>
+          <wp:inline distT="0" distB="0" distL="0" distR="0" wp14:anchorId="392C90D2" wp14:editId="7DBC7FF5">
+            <wp:extent cx="5731510" cy="1961353"/>
+            <wp:effectExtent l="0" t="0" r="0" b="0"/>
+            <wp:docPr id="215838676" name="Picture 215838676"/>
+            <wp:cNvGraphicFramePr>
+              <a:graphicFrameLocks xmlns:a="http://schemas.openxmlformats.org/drawingml/2006/main" noChangeAspect="1"/>
+            </wp:cNvGraphicFramePr>
+            <a:graphic xmlns:a="http://schemas.openxmlformats.org/drawingml/2006/main">
+              <a:graphicData uri="http://schemas.openxmlformats.org/drawingml/2006/picture">
+                <pic:pic xmlns:pic="http://schemas.openxmlformats.org/drawingml/2006/picture">
+                  <pic:nvPicPr>
+                    <pic:cNvPr id="1956460006" name=""/>
+                    <pic:cNvPicPr/>
+                  </pic:nvPicPr>
+                  <pic:blipFill>
+                    <a:blip r:embed="rId28"/>
+                    <a:stretch>
+                      <a:fillRect/>
+                    </a:stretch>
+                  </pic:blipFill>
+                  <pic:spPr>
+                    <a:xfrm>
+                      <a:off x="0" y="0"/>
+                      <a:ext cx="5731510" cy="1961353"/>
+                    </a:xfrm>
+                    <a:prstGeom prst="rect">
+                      <a:avLst/>
+                    </a:prstGeom>
+                  </pic:spPr>
+                </pic:pic>
+              </a:graphicData>
+            </a:graphic>
+          </wp:inline>
+        </w:drawing>
       </w:r>
     </w:p>
     <w:p>
@@ -6929,175 +4596,7 @@
           <w:rFonts w:ascii="Times New Roman" w:hAnsi="Times New Roman" w:cs="Times New Roman"/>
           <w:lang w:val="en-US"/>
         </w:rPr>
-        <w:t>Trên báo cáo chi</w:t>
-      </w:r>
-      <w:r>
-        <w:rPr>
-          <w:rFonts w:ascii="Times New Roman" w:hAnsi="Times New Roman" w:cs="Times New Roman"/>
-          <w:lang w:val="en-US"/>
-        </w:rPr>
-        <w:t>ế</w:t>
-      </w:r>
-      <w:r>
-        <w:rPr>
-          <w:rFonts w:ascii="Times New Roman" w:hAnsi="Times New Roman" w:cs="Times New Roman"/>
-          <w:lang w:val="en-US"/>
-        </w:rPr>
-        <w:t>n d</w:t>
-      </w:r>
-      <w:r>
-        <w:rPr>
-          <w:rFonts w:ascii="Times New Roman" w:hAnsi="Times New Roman" w:cs="Times New Roman"/>
-          <w:lang w:val="en-US"/>
-        </w:rPr>
-        <w:t>ị</w:t>
-      </w:r>
-      <w:r>
-        <w:rPr>
-          <w:rFonts w:ascii="Times New Roman" w:hAnsi="Times New Roman" w:cs="Times New Roman"/>
-          <w:lang w:val="en-US"/>
-        </w:rPr>
-        <w:t>ch, xe đư</w:t>
-      </w:r>
-      <w:r>
-        <w:rPr>
-          <w:rFonts w:ascii="Times New Roman" w:hAnsi="Times New Roman" w:cs="Times New Roman"/>
-          <w:lang w:val="en-US"/>
-        </w:rPr>
-        <w:t>ợ</w:t>
-      </w:r>
-      <w:r>
-        <w:rPr>
-          <w:rFonts w:ascii="Times New Roman" w:hAnsi="Times New Roman" w:cs="Times New Roman"/>
-          <w:lang w:val="en-US"/>
-        </w:rPr>
-        <w:t>c tính là đã th</w:t>
-      </w:r>
-      <w:r>
-        <w:rPr>
-          <w:rFonts w:ascii="Times New Roman" w:hAnsi="Times New Roman" w:cs="Times New Roman"/>
-          <w:lang w:val="en-US"/>
-        </w:rPr>
-        <w:t>ự</w:t>
-      </w:r>
-      <w:r>
-        <w:rPr>
-          <w:rFonts w:ascii="Times New Roman" w:hAnsi="Times New Roman" w:cs="Times New Roman"/>
-          <w:lang w:val="en-US"/>
-        </w:rPr>
-        <w:t>c hi</w:t>
-      </w:r>
-      <w:r>
-        <w:rPr>
-          <w:rFonts w:ascii="Times New Roman" w:hAnsi="Times New Roman" w:cs="Times New Roman"/>
-          <w:lang w:val="en-US"/>
-        </w:rPr>
-        <w:t>ệ</w:t>
-      </w:r>
-      <w:r>
-        <w:rPr>
-          <w:rFonts w:ascii="Times New Roman" w:hAnsi="Times New Roman" w:cs="Times New Roman"/>
-          <w:lang w:val="en-US"/>
-        </w:rPr>
-        <w:t>n khi có m</w:t>
-      </w:r>
-      <w:r>
-        <w:rPr>
-          <w:rFonts w:ascii="Times New Roman" w:hAnsi="Times New Roman" w:cs="Times New Roman"/>
-          <w:lang w:val="en-US"/>
-        </w:rPr>
-        <w:t>ở</w:t>
-      </w:r>
-      <w:r>
-        <w:rPr>
-          <w:rFonts w:ascii="Times New Roman" w:hAnsi="Times New Roman" w:cs="Times New Roman"/>
-          <w:lang w:val="en-US"/>
-        </w:rPr>
-        <w:t xml:space="preserve"> l</w:t>
-      </w:r>
-      <w:r>
-        <w:rPr>
-          <w:rFonts w:ascii="Times New Roman" w:hAnsi="Times New Roman" w:cs="Times New Roman"/>
-          <w:lang w:val="en-US"/>
-        </w:rPr>
-        <w:t>ệ</w:t>
-      </w:r>
-      <w:r>
-        <w:rPr>
-          <w:rFonts w:ascii="Times New Roman" w:hAnsi="Times New Roman" w:cs="Times New Roman"/>
-          <w:lang w:val="en-US"/>
-        </w:rPr>
-        <w:t>nh, đúng s</w:t>
-      </w:r>
-      <w:r>
-        <w:rPr>
-          <w:rFonts w:ascii="Times New Roman" w:hAnsi="Times New Roman" w:cs="Times New Roman"/>
-          <w:lang w:val="en-US"/>
-        </w:rPr>
-        <w:t>ố</w:t>
-      </w:r>
-      <w:r>
-        <w:rPr>
-          <w:rFonts w:ascii="Times New Roman" w:hAnsi="Times New Roman" w:cs="Times New Roman"/>
-          <w:lang w:val="en-US"/>
-        </w:rPr>
-        <w:t xml:space="preserve"> khung và có ch</w:t>
-      </w:r>
-      <w:r>
-        <w:rPr>
-          <w:rFonts w:ascii="Times New Roman" w:hAnsi="Times New Roman" w:cs="Times New Roman"/>
-          <w:lang w:val="en-US"/>
-        </w:rPr>
-        <w:t>ọ</w:t>
-      </w:r>
-      <w:r>
-        <w:rPr>
-          <w:rFonts w:ascii="Times New Roman" w:hAnsi="Times New Roman" w:cs="Times New Roman"/>
-          <w:lang w:val="en-US"/>
-        </w:rPr>
-        <w:t>n mã chi</w:t>
-      </w:r>
-      <w:r>
-        <w:rPr>
-          <w:rFonts w:ascii="Times New Roman" w:hAnsi="Times New Roman" w:cs="Times New Roman"/>
-          <w:lang w:val="en-US"/>
-        </w:rPr>
-        <w:t>ế</w:t>
-      </w:r>
-      <w:r>
-        <w:rPr>
-          <w:rFonts w:ascii="Times New Roman" w:hAnsi="Times New Roman" w:cs="Times New Roman"/>
-          <w:lang w:val="en-US"/>
-        </w:rPr>
-        <w:t>n d</w:t>
-      </w:r>
-      <w:r>
-        <w:rPr>
-          <w:rFonts w:ascii="Times New Roman" w:hAnsi="Times New Roman" w:cs="Times New Roman"/>
-          <w:lang w:val="en-US"/>
-        </w:rPr>
-        <w:t>ị</w:t>
-      </w:r>
-      <w:r>
-        <w:rPr>
-          <w:rFonts w:ascii="Times New Roman" w:hAnsi="Times New Roman" w:cs="Times New Roman"/>
-          <w:lang w:val="en-US"/>
-        </w:rPr>
-        <w:t xml:space="preserve">ch tương </w:t>
-      </w:r>
-      <w:r>
-        <w:rPr>
-          <w:rFonts w:ascii="Times New Roman" w:hAnsi="Times New Roman" w:cs="Times New Roman"/>
-          <w:lang w:val="en-US"/>
-        </w:rPr>
-        <w:t>ứ</w:t>
-      </w:r>
-      <w:r>
-        <w:rPr>
-          <w:rFonts w:ascii="Times New Roman" w:hAnsi="Times New Roman" w:cs="Times New Roman"/>
-          <w:lang w:val="en-US"/>
-        </w:rPr>
-        <w:t>ng.</w:t>
+        <w:t>Trên báo cáo chiến dịch, xe được tính là đã thực hiện khi có mở lệnh, đúng số khung và có chọn mã chiến dịch tương ứng.</w:t>
       </w:r>
     </w:p>
     <w:p>
@@ -7117,189 +4616,7 @@
           <w:rFonts w:ascii="Times New Roman" w:hAnsi="Times New Roman" w:cs="Times New Roman"/>
           <w:lang w:val="en-US"/>
         </w:rPr>
-        <w:t>Danh sách tr</w:t>
-      </w:r>
-      <w:r>
-        <w:rPr>
-          <w:rFonts w:ascii="Times New Roman" w:hAnsi="Times New Roman" w:cs="Times New Roman"/>
-          <w:lang w:val="en-US"/>
-        </w:rPr>
-        <w:t>ố</w:t>
-      </w:r>
-      <w:r>
-        <w:rPr>
-          <w:rFonts w:ascii="Times New Roman" w:hAnsi="Times New Roman" w:cs="Times New Roman"/>
-          <w:lang w:val="en-US"/>
-        </w:rPr>
-        <w:t>ng nghĩa là xe không thu</w:t>
-      </w:r>
-      <w:r>
-        <w:rPr>
-          <w:rFonts w:ascii="Times New Roman" w:hAnsi="Times New Roman" w:cs="Times New Roman"/>
-          <w:lang w:val="en-US"/>
-        </w:rPr>
-        <w:t>ộ</w:t>
-      </w:r>
-      <w:r>
-        <w:rPr>
-          <w:rFonts w:ascii="Times New Roman" w:hAnsi="Times New Roman" w:cs="Times New Roman"/>
-          <w:lang w:val="en-US"/>
-        </w:rPr>
-        <w:t>c chi</w:t>
-      </w:r>
-      <w:r>
-        <w:rPr>
-          <w:rFonts w:ascii="Times New Roman" w:hAnsi="Times New Roman" w:cs="Times New Roman"/>
-          <w:lang w:val="en-US"/>
-        </w:rPr>
-        <w:t>ế</w:t>
-      </w:r>
-      <w:r>
-        <w:rPr>
-          <w:rFonts w:ascii="Times New Roman" w:hAnsi="Times New Roman" w:cs="Times New Roman"/>
-          <w:lang w:val="en-US"/>
-        </w:rPr>
-        <w:t>n d</w:t>
-      </w:r>
-      <w:r>
-        <w:rPr>
-          <w:rFonts w:ascii="Times New Roman" w:hAnsi="Times New Roman" w:cs="Times New Roman"/>
-          <w:lang w:val="en-US"/>
-        </w:rPr>
-        <w:t>ị</w:t>
-      </w:r>
-      <w:r>
-        <w:rPr>
-          <w:rFonts w:ascii="Times New Roman" w:hAnsi="Times New Roman" w:cs="Times New Roman"/>
-          <w:lang w:val="en-US"/>
-        </w:rPr>
-        <w:t>ch nào, ho</w:t>
-      </w:r>
-      <w:r>
-        <w:rPr>
-          <w:rFonts w:ascii="Times New Roman" w:hAnsi="Times New Roman" w:cs="Times New Roman"/>
-          <w:lang w:val="en-US"/>
-        </w:rPr>
-        <w:t>ặ</w:t>
-      </w:r>
-      <w:r>
-        <w:rPr>
-          <w:rFonts w:ascii="Times New Roman" w:hAnsi="Times New Roman" w:cs="Times New Roman"/>
-          <w:lang w:val="en-US"/>
-        </w:rPr>
-        <w:t>c CSKH chưa đăng ký s</w:t>
-      </w:r>
-      <w:r>
-        <w:rPr>
-          <w:rFonts w:ascii="Times New Roman" w:hAnsi="Times New Roman" w:cs="Times New Roman"/>
-          <w:lang w:val="en-US"/>
-        </w:rPr>
-        <w:t>ố</w:t>
-      </w:r>
-      <w:r>
-        <w:rPr>
-          <w:rFonts w:ascii="Times New Roman" w:hAnsi="Times New Roman" w:cs="Times New Roman"/>
-          <w:lang w:val="en-US"/>
-        </w:rPr>
-        <w:t xml:space="preserve"> khung vào chi</w:t>
-      </w:r>
-      <w:r>
-        <w:rPr>
-          <w:rFonts w:ascii="Times New Roman" w:hAnsi="Times New Roman" w:cs="Times New Roman"/>
-          <w:lang w:val="en-US"/>
-        </w:rPr>
-        <w:t>ế</w:t>
-      </w:r>
-      <w:r>
-        <w:rPr>
-          <w:rFonts w:ascii="Times New Roman" w:hAnsi="Times New Roman" w:cs="Times New Roman"/>
-          <w:lang w:val="en-US"/>
-        </w:rPr>
-        <w:t>n d</w:t>
-      </w:r>
-      <w:r>
-        <w:rPr>
-          <w:rFonts w:ascii="Times New Roman" w:hAnsi="Times New Roman" w:cs="Times New Roman"/>
-          <w:lang w:val="en-US"/>
-        </w:rPr>
-        <w:t>ị</w:t>
-      </w:r>
-      <w:r>
-        <w:rPr>
-          <w:rFonts w:ascii="Times New Roman" w:hAnsi="Times New Roman" w:cs="Times New Roman"/>
-          <w:lang w:val="en-US"/>
-        </w:rPr>
-        <w:t>ch (xem HDSD CSKH – C</w:t>
-      </w:r>
-      <w:r>
-        <w:rPr>
-          <w:rFonts w:ascii="Times New Roman" w:hAnsi="Times New Roman" w:cs="Times New Roman"/>
-          <w:lang w:val="en-US"/>
-        </w:rPr>
-        <w:t>ậ</w:t>
-      </w:r>
-      <w:r>
-        <w:rPr>
-          <w:rFonts w:ascii="Times New Roman" w:hAnsi="Times New Roman" w:cs="Times New Roman"/>
-          <w:lang w:val="en-US"/>
-        </w:rPr>
-        <w:t>p nh</w:t>
-      </w:r>
-      <w:r>
-        <w:rPr>
-          <w:rFonts w:ascii="Times New Roman" w:hAnsi="Times New Roman" w:cs="Times New Roman"/>
-          <w:lang w:val="en-US"/>
-        </w:rPr>
-        <w:t>ậ</w:t>
-      </w:r>
-      <w:r>
-        <w:rPr>
-          <w:rFonts w:ascii="Times New Roman" w:hAnsi="Times New Roman" w:cs="Times New Roman"/>
-          <w:lang w:val="en-US"/>
-        </w:rPr>
-        <w:t>t thông tin chi</w:t>
-      </w:r>
-      <w:r>
-        <w:rPr>
-          <w:rFonts w:ascii="Times New Roman" w:hAnsi="Times New Roman" w:cs="Times New Roman"/>
-          <w:lang w:val="en-US"/>
-        </w:rPr>
-        <w:t>ế</w:t>
-      </w:r>
-      <w:r>
-        <w:rPr>
-          <w:rFonts w:ascii="Times New Roman" w:hAnsi="Times New Roman" w:cs="Times New Roman"/>
-          <w:lang w:val="en-US"/>
-        </w:rPr>
-        <w:t>n d</w:t>
-      </w:r>
-      <w:r>
-        <w:rPr>
-          <w:rFonts w:ascii="Times New Roman" w:hAnsi="Times New Roman" w:cs="Times New Roman"/>
-          <w:lang w:val="en-US"/>
-        </w:rPr>
-        <w:t>ị</w:t>
-      </w:r>
-      <w:r>
-        <w:rPr>
-          <w:rFonts w:ascii="Times New Roman" w:hAnsi="Times New Roman" w:cs="Times New Roman"/>
-          <w:lang w:val="en-US"/>
-        </w:rPr>
-        <w:t>ch). User báo CSKH ki</w:t>
-      </w:r>
-      <w:r>
-        <w:rPr>
-          <w:rFonts w:ascii="Times New Roman" w:hAnsi="Times New Roman" w:cs="Times New Roman"/>
-          <w:lang w:val="en-US"/>
-        </w:rPr>
-        <w:t>ể</w:t>
-      </w:r>
-      <w:r>
-        <w:rPr>
-          <w:rFonts w:ascii="Times New Roman" w:hAnsi="Times New Roman" w:cs="Times New Roman"/>
-          <w:lang w:val="en-US"/>
-        </w:rPr>
-        <w:t>m tra.</w:t>
+        <w:t>Danh sách trống nghĩa là xe không thuộc chiến dịch nào, hoặc CSKH chưa đăng ký số khung vào chiến dịch (xem HDSD CSKH – Cập nhật thông tin chiến dịch). User báo CSKH kiểm tra.</w:t>
       </w:r>
     </w:p>
     <w:p>
@@ -7319,189 +4636,7 @@
           <w:rFonts w:ascii="Times New Roman" w:hAnsi="Times New Roman" w:cs="Times New Roman"/>
           <w:lang w:val="en-US"/>
         </w:rPr>
-        <w:t>L</w:t>
-      </w:r>
-      <w:r>
-        <w:rPr>
-          <w:rFonts w:ascii="Times New Roman" w:hAnsi="Times New Roman" w:cs="Times New Roman"/>
-          <w:lang w:val="en-US"/>
-        </w:rPr>
-        <w:t>ệ</w:t>
-      </w:r>
-      <w:r>
-        <w:rPr>
-          <w:rFonts w:ascii="Times New Roman" w:hAnsi="Times New Roman" w:cs="Times New Roman"/>
-          <w:lang w:val="en-US"/>
-        </w:rPr>
-        <w:t>nh đã nghi</w:t>
-      </w:r>
-      <w:r>
-        <w:rPr>
-          <w:rFonts w:ascii="Times New Roman" w:hAnsi="Times New Roman" w:cs="Times New Roman"/>
-          <w:lang w:val="en-US"/>
-        </w:rPr>
-        <w:t>ệ</w:t>
-      </w:r>
-      <w:r>
-        <w:rPr>
-          <w:rFonts w:ascii="Times New Roman" w:hAnsi="Times New Roman" w:cs="Times New Roman"/>
-          <w:lang w:val="en-US"/>
-        </w:rPr>
-        <w:t>m thu mu</w:t>
-      </w:r>
-      <w:r>
-        <w:rPr>
-          <w:rFonts w:ascii="Times New Roman" w:hAnsi="Times New Roman" w:cs="Times New Roman"/>
-          <w:lang w:val="en-US"/>
-        </w:rPr>
-        <w:t>ố</w:t>
-      </w:r>
-      <w:r>
-        <w:rPr>
-          <w:rFonts w:ascii="Times New Roman" w:hAnsi="Times New Roman" w:cs="Times New Roman"/>
-          <w:lang w:val="en-US"/>
-        </w:rPr>
-        <w:t>n ch</w:t>
-      </w:r>
-      <w:r>
-        <w:rPr>
-          <w:rFonts w:ascii="Times New Roman" w:hAnsi="Times New Roman" w:cs="Times New Roman"/>
-          <w:lang w:val="en-US"/>
-        </w:rPr>
-        <w:t>ọ</w:t>
-      </w:r>
-      <w:r>
-        <w:rPr>
-          <w:rFonts w:ascii="Times New Roman" w:hAnsi="Times New Roman" w:cs="Times New Roman"/>
-          <w:lang w:val="en-US"/>
-        </w:rPr>
-        <w:t>n b</w:t>
-      </w:r>
-      <w:r>
-        <w:rPr>
-          <w:rFonts w:ascii="Times New Roman" w:hAnsi="Times New Roman" w:cs="Times New Roman"/>
-          <w:lang w:val="en-US"/>
-        </w:rPr>
-        <w:t>ổ</w:t>
-      </w:r>
-      <w:r>
-        <w:rPr>
-          <w:rFonts w:ascii="Times New Roman" w:hAnsi="Times New Roman" w:cs="Times New Roman"/>
-          <w:lang w:val="en-US"/>
-        </w:rPr>
-        <w:t xml:space="preserve"> sung chi</w:t>
-      </w:r>
-      <w:r>
-        <w:rPr>
-          <w:rFonts w:ascii="Times New Roman" w:hAnsi="Times New Roman" w:cs="Times New Roman"/>
-          <w:lang w:val="en-US"/>
-        </w:rPr>
-        <w:t>ế</w:t>
-      </w:r>
-      <w:r>
-        <w:rPr>
-          <w:rFonts w:ascii="Times New Roman" w:hAnsi="Times New Roman" w:cs="Times New Roman"/>
-          <w:lang w:val="en-US"/>
-        </w:rPr>
-        <w:t>n d</w:t>
-      </w:r>
-      <w:r>
-        <w:rPr>
-          <w:rFonts w:ascii="Times New Roman" w:hAnsi="Times New Roman" w:cs="Times New Roman"/>
-          <w:lang w:val="en-US"/>
-        </w:rPr>
-        <w:t>ị</w:t>
-      </w:r>
-      <w:r>
-        <w:rPr>
-          <w:rFonts w:ascii="Times New Roman" w:hAnsi="Times New Roman" w:cs="Times New Roman"/>
-          <w:lang w:val="en-US"/>
-        </w:rPr>
-        <w:t>ch thì ph</w:t>
-      </w:r>
-      <w:r>
-        <w:rPr>
-          <w:rFonts w:ascii="Times New Roman" w:hAnsi="Times New Roman" w:cs="Times New Roman"/>
-          <w:lang w:val="en-US"/>
-        </w:rPr>
-        <w:t>ả</w:t>
-      </w:r>
-      <w:r>
-        <w:rPr>
-          <w:rFonts w:ascii="Times New Roman" w:hAnsi="Times New Roman" w:cs="Times New Roman"/>
-          <w:lang w:val="en-US"/>
-        </w:rPr>
-        <w:t>i h</w:t>
-      </w:r>
-      <w:r>
-        <w:rPr>
-          <w:rFonts w:ascii="Times New Roman" w:hAnsi="Times New Roman" w:cs="Times New Roman"/>
-          <w:lang w:val="en-US"/>
-        </w:rPr>
-        <w:t>ạ</w:t>
-      </w:r>
-      <w:r>
-        <w:rPr>
-          <w:rFonts w:ascii="Times New Roman" w:hAnsi="Times New Roman" w:cs="Times New Roman"/>
-          <w:lang w:val="en-US"/>
-        </w:rPr>
-        <w:t xml:space="preserve"> tr</w:t>
-      </w:r>
-      <w:r>
-        <w:rPr>
-          <w:rFonts w:ascii="Times New Roman" w:hAnsi="Times New Roman" w:cs="Times New Roman"/>
-          <w:lang w:val="en-US"/>
-        </w:rPr>
-        <w:t>ạ</w:t>
-      </w:r>
-      <w:r>
-        <w:rPr>
-          <w:rFonts w:ascii="Times New Roman" w:hAnsi="Times New Roman" w:cs="Times New Roman"/>
-          <w:lang w:val="en-US"/>
-        </w:rPr>
-        <w:t>ng thái l</w:t>
-      </w:r>
-      <w:r>
-        <w:rPr>
-          <w:rFonts w:ascii="Times New Roman" w:hAnsi="Times New Roman" w:cs="Times New Roman"/>
-          <w:lang w:val="en-US"/>
-        </w:rPr>
-        <w:t>ệ</w:t>
-      </w:r>
-      <w:r>
-        <w:rPr>
-          <w:rFonts w:ascii="Times New Roman" w:hAnsi="Times New Roman" w:cs="Times New Roman"/>
-          <w:lang w:val="en-US"/>
-        </w:rPr>
-        <w:t>nh xu</w:t>
-      </w:r>
-      <w:r>
-        <w:rPr>
-          <w:rFonts w:ascii="Times New Roman" w:hAnsi="Times New Roman" w:cs="Times New Roman"/>
-          <w:lang w:val="en-US"/>
-        </w:rPr>
-        <w:t>ố</w:t>
-      </w:r>
-      <w:r>
-        <w:rPr>
-          <w:rFonts w:ascii="Times New Roman" w:hAnsi="Times New Roman" w:cs="Times New Roman"/>
-          <w:lang w:val="en-US"/>
-        </w:rPr>
-        <w:t>ng trư</w:t>
-      </w:r>
-      <w:r>
-        <w:rPr>
-          <w:rFonts w:ascii="Times New Roman" w:hAnsi="Times New Roman" w:cs="Times New Roman"/>
-          <w:lang w:val="en-US"/>
-        </w:rPr>
-        <w:t>ớ</w:t>
-      </w:r>
-      <w:r>
-        <w:rPr>
-          <w:rFonts w:ascii="Times New Roman" w:hAnsi="Times New Roman" w:cs="Times New Roman"/>
-          <w:lang w:val="en-US"/>
-        </w:rPr>
-        <w:t>c.</w:t>
+        <w:t>Lệnh đã nghiệm thu muốn chọn bổ sung chiến dịch thì phải hạ trạng thái lệnh xuống trước.</w:t>
       </w:r>
     </w:p>
     <w:p>
@@ -7541,7 +4676,7 @@
           <w:lang w:val="en-US"/>
         </w:rPr>
       </w:pPr>
-      <w:bookmarkStart w:id="16" w:name="_Toc243925891"/>
+      <w:bookmarkStart w:id="16" w:name="_Toc243928218"/>
       <w:r>
         <w:rPr>
           <w:rFonts w:ascii="Times New Roman" w:hAnsi="Times New Roman" w:cs="Times New Roman"/>
@@ -7571,7 +4706,7 @@
           <w:lang w:val="en-US"/>
         </w:rPr>
       </w:pPr>
-      <w:bookmarkStart w:id="17" w:name="_Toc243925892"/>
+      <w:bookmarkStart w:id="17" w:name="_Toc243928219"/>
       <w:r>
         <w:rPr>
           <w:rFonts w:ascii="Times New Roman" w:hAnsi="Times New Roman" w:cs="Times New Roman"/>
@@ -7619,7 +4754,7 @@
           <w:lang w:val="en-US"/>
         </w:rPr>
       </w:pPr>
-      <w:bookmarkStart w:id="18" w:name="_Toc243925893"/>
+      <w:bookmarkStart w:id="18" w:name="_Toc243928220"/>
       <w:r>
         <w:rPr>
           <w:rFonts w:ascii="Times New Roman" w:hAnsi="Times New Roman" w:cs="Times New Roman"/>
@@ -7696,7 +4831,7 @@
           <w:lang w:val="en-US"/>
         </w:rPr>
       </w:pPr>
-      <w:bookmarkStart w:id="19" w:name="_Toc243925894"/>
+      <w:bookmarkStart w:id="19" w:name="_Toc243928221"/>
       <w:r>
         <w:rPr>
           <w:rFonts w:ascii="Times New Roman" w:hAnsi="Times New Roman" w:cs="Times New Roman"/>
@@ -7769,7 +4904,7 @@
                     <pic:cNvPicPr/>
                   </pic:nvPicPr>
                   <pic:blipFill>
-                    <a:blip r:embed="rId28"/>
+                    <a:blip r:embed="rId29"/>
                     <a:stretch>
                       <a:fillRect/>
                     </a:stretch>
@@ -7905,7 +5040,7 @@
           <w:lang w:val="en-US"/>
         </w:rPr>
       </w:pPr>
-      <w:bookmarkStart w:id="20" w:name="_Toc243925895"/>
+      <w:bookmarkStart w:id="20" w:name="_Toc243928222"/>
       <w:r>
         <w:rPr>
           <w:rFonts w:ascii="Times New Roman" w:hAnsi="Times New Roman" w:cs="Times New Roman"/>
@@ -7935,7 +5070,7 @@
           <w:lang w:val="en-US"/>
         </w:rPr>
       </w:pPr>
-      <w:bookmarkStart w:id="21" w:name="_Toc243925896"/>
+      <w:bookmarkStart w:id="21" w:name="_Toc243928223"/>
       <w:r>
         <w:rPr>
           <w:rFonts w:ascii="Times New Roman" w:hAnsi="Times New Roman" w:cs="Times New Roman"/>
@@ -8003,7 +5138,7 @@
           <w:lang w:val="en-US"/>
         </w:rPr>
       </w:pPr>
-      <w:bookmarkStart w:id="22" w:name="_Toc243925897"/>
+      <w:bookmarkStart w:id="22" w:name="_Toc243928224"/>
       <w:r>
         <w:rPr>
           <w:rFonts w:ascii="Times New Roman" w:hAnsi="Times New Roman" w:cs="Times New Roman"/>
@@ -8043,7 +5178,7 @@
                     <pic:cNvPicPr/>
                   </pic:nvPicPr>
                   <pic:blipFill>
-                    <a:blip r:embed="rId29"/>
+                    <a:blip r:embed="rId30"/>
                     <a:stretch>
                       <a:fillRect/>
                     </a:stretch>
@@ -8079,7 +5214,7 @@
           <w:lang w:val="en-US"/>
         </w:rPr>
       </w:pPr>
-      <w:bookmarkStart w:id="23" w:name="_Toc243925898"/>
+      <w:bookmarkStart w:id="23" w:name="_Toc243928225"/>
       <w:r>
         <w:rPr>
           <w:rFonts w:ascii="Times New Roman" w:hAnsi="Times New Roman" w:cs="Times New Roman"/>
@@ -8152,7 +5287,7 @@
                     <pic:cNvPicPr/>
                   </pic:nvPicPr>
                   <pic:blipFill>
-                    <a:blip r:embed="rId30"/>
+                    <a:blip r:embed="rId31"/>
                     <a:stretch>
                       <a:fillRect/>
                     </a:stretch>
@@ -8233,7 +5368,7 @@
                     <pic:cNvPicPr/>
                   </pic:nvPicPr>
                   <pic:blipFill>
-                    <a:blip r:embed="rId31"/>
+                    <a:blip r:embed="rId32"/>
                     <a:stretch>
                       <a:fillRect/>
                     </a:stretch>
@@ -8341,7 +5476,7 @@
                     <pic:cNvPicPr/>
                   </pic:nvPicPr>
                   <pic:blipFill>
-                    <a:blip r:embed="rId32"/>
+                    <a:blip r:embed="rId33"/>
                     <a:stretch>
                       <a:fillRect/>
                     </a:stretch>
@@ -8450,7 +5585,7 @@
           <w:lang w:val="en-US"/>
         </w:rPr>
       </w:pPr>
-      <w:bookmarkStart w:id="24" w:name="_Toc243925899"/>
+      <w:bookmarkStart w:id="24" w:name="_Toc243928226"/>
       <w:r>
         <w:rPr>
           <w:rFonts w:ascii="Times New Roman" w:hAnsi="Times New Roman" w:cs="Times New Roman"/>
@@ -8480,7 +5615,7 @@
           <w:lang w:val="en-US"/>
         </w:rPr>
       </w:pPr>
-      <w:bookmarkStart w:id="25" w:name="_Toc243925900"/>
+      <w:bookmarkStart w:id="25" w:name="_Toc243928227"/>
       <w:r>
         <w:rPr>
           <w:rFonts w:ascii="Times New Roman" w:hAnsi="Times New Roman" w:cs="Times New Roman"/>
@@ -8528,7 +5663,7 @@
           <w:lang w:val="en-US"/>
         </w:rPr>
       </w:pPr>
-      <w:bookmarkStart w:id="26" w:name="_Toc243925901"/>
+      <w:bookmarkStart w:id="26" w:name="_Toc243928228"/>
       <w:r>
         <w:rPr>
           <w:rFonts w:ascii="Times New Roman" w:hAnsi="Times New Roman" w:cs="Times New Roman"/>
@@ -8571,7 +5706,7 @@
                     <pic:cNvPicPr/>
                   </pic:nvPicPr>
                   <pic:blipFill>
-                    <a:blip r:embed="rId33"/>
+                    <a:blip r:embed="rId34"/>
                     <a:stretch>
                       <a:fillRect/>
                     </a:stretch>
@@ -8607,7 +5742,7 @@
           <w:lang w:val="en-US"/>
         </w:rPr>
       </w:pPr>
-      <w:bookmarkStart w:id="27" w:name="_Toc243925902"/>
+      <w:bookmarkStart w:id="27" w:name="_Toc243928229"/>
       <w:r>
         <w:rPr>
           <w:rFonts w:ascii="Times New Roman" w:hAnsi="Times New Roman" w:cs="Times New Roman"/>
@@ -8680,7 +5815,7 @@
                     <pic:cNvPicPr/>
                   </pic:nvPicPr>
                   <pic:blipFill>
-                    <a:blip r:embed="rId34"/>
+                    <a:blip r:embed="rId35"/>
                     <a:stretch>
                       <a:fillRect/>
                     </a:stretch>
@@ -8748,7 +5883,7 @@
                     <pic:cNvPicPr/>
                   </pic:nvPicPr>
                   <pic:blipFill>
-                    <a:blip r:embed="rId35"/>
+                    <a:blip r:embed="rId36"/>
                     <a:stretch>
                       <a:fillRect/>
                     </a:stretch>
@@ -8816,7 +5951,7 @@
                     <pic:cNvPicPr/>
                   </pic:nvPicPr>
                   <pic:blipFill>
-                    <a:blip r:embed="rId36"/>
+                    <a:blip r:embed="rId37"/>
                     <a:stretch>
                       <a:fillRect/>
                     </a:stretch>
@@ -8877,7 +6012,7 @@
                     <pic:cNvPicPr/>
                   </pic:nvPicPr>
                   <pic:blipFill>
-                    <a:blip r:embed="rId37"/>
+                    <a:blip r:embed="rId38"/>
                     <a:stretch>
                       <a:fillRect/>
                     </a:stretch>

</xml_diff>